<commit_message>
work on word doc- halfway on fixing
</commit_message>
<xml_diff>
--- a/NEA Paperwork HP.docx
+++ b/NEA Paperwork HP.docx
@@ -7,7 +7,13 @@
         <w:pStyle w:val="Title"/>
       </w:pPr>
       <w:r>
-        <w:t xml:space="preserve">2D RPG </w:t>
+        <w:t xml:space="preserve">2D </w:t>
+      </w:r>
+      <w:r>
+        <w:t>Roguelike</w:t>
+      </w:r>
+      <w:r>
+        <w:t xml:space="preserve"> </w:t>
       </w:r>
     </w:p>
     <w:p>
@@ -427,14 +433,28 @@
           <w:sz w:val="24"/>
           <w:szCs w:val="24"/>
         </w:rPr>
-        <w:t xml:space="preserve">For my project, I aim to create a 2D, top-down RPG game including exploration and combat. The game will include semi-intelligent enemies which will use a </w:t>
-      </w:r>
-      <w:r>
-        <w:rPr>
-          <w:sz w:val="24"/>
-          <w:szCs w:val="24"/>
-        </w:rPr>
-        <w:t>pathfinding algorithm to follow the player and a Finite-State system to make their decisions seem planned. I will make the game somewhat difficult as I want it to be a ‘souls-like’, meaning it is similar to the games from the Dark Souls series. This series contains very difficult enemies which present the player with a great challenge which can be enjoyable and very rewarding. The game will be targeted towards players of this genre as they enjoy this style of game.</w:t>
+        <w:t xml:space="preserve">For my project, I aim to create a 2D, top-down </w:t>
+      </w:r>
+      <w:r>
+        <w:rPr>
+          <w:sz w:val="24"/>
+          <w:szCs w:val="24"/>
+        </w:rPr>
+        <w:t>Roguelike</w:t>
+      </w:r>
+      <w:r>
+        <w:rPr>
+          <w:sz w:val="24"/>
+          <w:szCs w:val="24"/>
+        </w:rPr>
+        <w:t xml:space="preserve"> game including exploration and combat. The game will include semi-intelligent enemies which will use a pathfinding algorithm to follow the player and a Finite-State system to make their decisions seem planned. </w:t>
+      </w:r>
+      <w:r>
+        <w:rPr>
+          <w:sz w:val="24"/>
+          <w:szCs w:val="24"/>
+        </w:rPr>
+        <w:t>The player will perform ‘runs’ of the game in which they will enter a randomly generate map. By killing enemies and performing certain tasks they will be able to gain useful upgrades and items to assist them in future runs.</w:t>
       </w:r>
     </w:p>
     <w:p>
@@ -459,7 +479,55 @@
           <w:sz w:val="24"/>
           <w:szCs w:val="24"/>
         </w:rPr>
-        <w:t>I have chosen this as my project as I am interested in game development and would like to expand my knowledge of the techniques used by creating my own game. Through my research for my NEA I will hopefully learn how video games are created by large companies and also pick up some skills which may become useful in my future.</w:t>
+        <w:t xml:space="preserve">Roguelike games use a system of repeated gameplay which keeps it interesting for the player </w:t>
+      </w:r>
+      <w:r>
+        <w:rPr>
+          <w:sz w:val="24"/>
+          <w:szCs w:val="24"/>
+        </w:rPr>
+        <w:t>while providing different styles of play to make each run interesting and not bore the player. By collecting XP and completing tasks within the game they can unlock upgrades and items which can provide new experiences or allow the player to progress further within the game.</w:t>
+      </w:r>
+    </w:p>
+    <w:p>
+      <w:pPr>
+        <w:jc w:val="center"/>
+        <w:rPr>
+          <w:sz w:val="24"/>
+          <w:szCs w:val="24"/>
+        </w:rPr>
+      </w:pPr>
+    </w:p>
+    <w:p>
+      <w:pPr>
+        <w:jc w:val="center"/>
+        <w:rPr>
+          <w:sz w:val="24"/>
+          <w:szCs w:val="24"/>
+        </w:rPr>
+      </w:pPr>
+      <w:r>
+        <w:rPr>
+          <w:sz w:val="24"/>
+          <w:szCs w:val="24"/>
+        </w:rPr>
+        <w:t xml:space="preserve">I have chosen this as my project as I am interested in game development and would like to expand my knowledge of the techniques used by creating my own game. Through my research for my </w:t>
+      </w:r>
+      <w:proofErr w:type="gramStart"/>
+      <w:r>
+        <w:rPr>
+          <w:sz w:val="24"/>
+          <w:szCs w:val="24"/>
+        </w:rPr>
+        <w:t>NEA</w:t>
+      </w:r>
+      <w:proofErr w:type="gramEnd"/>
+      <w:r>
+        <w:rPr>
+          <w:sz w:val="24"/>
+          <w:szCs w:val="24"/>
+        </w:rPr>
+        <w:t xml:space="preserve"> I will hopefully learn how video games are created by large companies and also pick up some skills which may become useful in my future.</w:t>
       </w:r>
     </w:p>
     <w:p>
@@ -531,7 +599,35 @@
           <w:sz w:val="24"/>
           <w:szCs w:val="24"/>
         </w:rPr>
-        <w:t>For my interview I will talk to someone within my school who is interested in this genre of game. I feel that asking questions to the intended audience will be the best way to gauge what is wanted from my project by potential players. This interview will assist me in tailoring my design to the needs of the player and will give me an insight into this genre of games as the person I will talk to is experienced in this genre.</w:t>
+        <w:t>For my interview I will ta</w:t>
+      </w:r>
+      <w:r>
+        <w:rPr>
+          <w:sz w:val="24"/>
+          <w:szCs w:val="24"/>
+        </w:rPr>
+        <w:t>lk to Leo (17), a student in my school who has 2000+ hours of gameplay in the roguelike genre</w:t>
+      </w:r>
+      <w:r>
+        <w:rPr>
+          <w:sz w:val="24"/>
+          <w:szCs w:val="24"/>
+        </w:rPr>
+        <w:t>. I feel that asking questions to the intended audience will be the best way to gauge what is wanted from my project by potential players.</w:t>
+      </w:r>
+      <w:r>
+        <w:rPr>
+          <w:sz w:val="24"/>
+          <w:szCs w:val="24"/>
+        </w:rPr>
+        <w:t xml:space="preserve"> Leo will be really useful to me as he has lots of experience.</w:t>
+      </w:r>
+      <w:r>
+        <w:rPr>
+          <w:sz w:val="24"/>
+          <w:szCs w:val="24"/>
+        </w:rPr>
+        <w:t xml:space="preserve"> This interview will assist me in tailoring my design to the needs of the player and will give me an insight into this genre.</w:t>
       </w:r>
     </w:p>
     <w:p>
@@ -576,7 +672,42 @@
           <w:sz w:val="24"/>
           <w:szCs w:val="24"/>
         </w:rPr>
-        <w:t xml:space="preserve">A – I currently play games such as Dark souls and Elden ring which fit well into this genre. I feel as though the game should draw inspiration from these games and the others in the series as they form the basis of ‘souls-like’ games. </w:t>
+        <w:t>A – I currently play games such as</w:t>
+      </w:r>
+      <w:r>
+        <w:rPr>
+          <w:sz w:val="24"/>
+          <w:szCs w:val="24"/>
+        </w:rPr>
+        <w:t xml:space="preserve"> ’The Binding of Isaac’, ‘Mewgenics’</w:t>
+      </w:r>
+      <w:r>
+        <w:rPr>
+          <w:sz w:val="24"/>
+          <w:szCs w:val="24"/>
+        </w:rPr>
+        <w:t xml:space="preserve"> and ‘Hades’</w:t>
+      </w:r>
+      <w:r>
+        <w:rPr>
+          <w:sz w:val="24"/>
+          <w:szCs w:val="24"/>
+        </w:rPr>
+        <w:t>.</w:t>
+      </w:r>
+      <w:r>
+        <w:rPr>
+          <w:sz w:val="24"/>
+          <w:szCs w:val="24"/>
+        </w:rPr>
+        <w:t xml:space="preserve"> I feel like these games do aspects of the roguelike genre really well. For example, ‘The Binding of Isaac’ uses a system which creates new attacks based on the combinations of equipped items. This keeps the game interesting to the player as it creates unexpected effects.</w:t>
+      </w:r>
+      <w:r>
+        <w:rPr>
+          <w:sz w:val="24"/>
+          <w:szCs w:val="24"/>
+        </w:rPr>
+        <w:t xml:space="preserve"> </w:t>
       </w:r>
     </w:p>
     <w:p>
@@ -623,7 +754,6 @@
           <w:sz w:val="24"/>
           <w:szCs w:val="24"/>
         </w:rPr>
-        <w:lastRenderedPageBreak/>
         <w:t>Q – How do you think the enemies should feel to fight?</w:t>
       </w:r>
     </w:p>
@@ -640,7 +770,37 @@
           <w:sz w:val="24"/>
           <w:szCs w:val="24"/>
         </w:rPr>
-        <w:t>A – I think the enemies should feel like a challenge to face in combat but should not be so difficult as to overwhelm the player. I enjoy when I have to spend time planning how I will fight each enemy as thing brings a sense of achievement when I defeat it so they need to be difficult enough that I can do this. This also means that they need to be somewhat predictable as I find it annoying as a player if the enemy behaves in one way but changes once I feel I have worked out how I will defeat it.</w:t>
+        <w:t xml:space="preserve">A – I think the enemies should feel like a challenge to face in combat but should not be so difficult as to overwhelm the player. I enjoy </w:t>
+      </w:r>
+      <w:r>
+        <w:rPr>
+          <w:sz w:val="24"/>
+          <w:szCs w:val="24"/>
+        </w:rPr>
+        <w:t xml:space="preserve">having to learn the attacks of each enemy as it feels like each </w:t>
+      </w:r>
+      <w:proofErr w:type="gramStart"/>
+      <w:r>
+        <w:rPr>
+          <w:sz w:val="24"/>
+          <w:szCs w:val="24"/>
+        </w:rPr>
+        <w:t>run</w:t>
+      </w:r>
+      <w:proofErr w:type="gramEnd"/>
+      <w:r>
+        <w:rPr>
+          <w:sz w:val="24"/>
+          <w:szCs w:val="24"/>
+        </w:rPr>
+        <w:t xml:space="preserve"> I make new progress and gain skill.</w:t>
+      </w:r>
+      <w:r>
+        <w:rPr>
+          <w:sz w:val="24"/>
+          <w:szCs w:val="24"/>
+        </w:rPr>
+        <w:t xml:space="preserve"> However, I don’t think the enemies should be to predictable or easy to learn as it sometimes feels that fights which should take time may end very quickly.</w:t>
       </w:r>
     </w:p>
     <w:p>
@@ -685,14 +845,39 @@
           <w:sz w:val="24"/>
           <w:szCs w:val="24"/>
         </w:rPr>
-        <w:t>A – I enjoy when the movement and combat is fast paced but sometimes find as a player that too much speed can become chaotic. You will need to find a balance to make the game engaging but not overwhelming. I often find that games with slow movement speed can make me very bored. Same for combat, if I’m waiting ages for an opening I get tired of the fight. I do enjoy when games give you the choice of pace. Some games use armour weight systems which give s the player the decision how fast they want to play bas</w:t>
-      </w:r>
-      <w:r>
-        <w:rPr>
-          <w:sz w:val="24"/>
-          <w:szCs w:val="24"/>
-        </w:rPr>
-        <w:t>ed on the build they intend to use.</w:t>
+        <w:t xml:space="preserve">A – I enjoy when the movement and combat is fast paced but sometimes find as a player that too much speed can become chaotic. You will need to find a balance to make the game engaging but not overwhelming. I often find that games with slow movement speed can make me very bored. Same for combat, if I’m waiting ages for an </w:t>
+      </w:r>
+      <w:proofErr w:type="gramStart"/>
+      <w:r>
+        <w:rPr>
+          <w:sz w:val="24"/>
+          <w:szCs w:val="24"/>
+        </w:rPr>
+        <w:t>opening</w:t>
+      </w:r>
+      <w:proofErr w:type="gramEnd"/>
+      <w:r>
+        <w:rPr>
+          <w:sz w:val="24"/>
+          <w:szCs w:val="24"/>
+        </w:rPr>
+        <w:t xml:space="preserve"> I get tired of the fight. I do enjoy when games give you the choice of pace. Some games use armour weight systems which give </w:t>
+      </w:r>
+      <w:proofErr w:type="spellStart"/>
+      <w:r>
+        <w:rPr>
+          <w:sz w:val="24"/>
+          <w:szCs w:val="24"/>
+        </w:rPr>
+        <w:t>s</w:t>
+      </w:r>
+      <w:proofErr w:type="spellEnd"/>
+      <w:r>
+        <w:rPr>
+          <w:sz w:val="24"/>
+          <w:szCs w:val="24"/>
+        </w:rPr>
+        <w:t xml:space="preserve"> the player the decision how fast they want to play based on the build they intend to use.</w:t>
       </w:r>
     </w:p>
     <w:p>
@@ -723,16 +908,7 @@
           <w:sz w:val="24"/>
           <w:szCs w:val="24"/>
         </w:rPr>
-        <w:t xml:space="preserve">Q – How would you like the </w:t>
-      </w:r>
-      <w:r>
-        <w:rPr>
-          <w:b/>
-          <w:bCs/>
-          <w:sz w:val="24"/>
-          <w:szCs w:val="24"/>
-        </w:rPr>
-        <w:t>interface/HUD to look?</w:t>
+        <w:t>Q – How would you like the interface/HUD to look?</w:t>
       </w:r>
     </w:p>
     <w:p>
@@ -748,7 +924,14 @@
           <w:sz w:val="24"/>
           <w:szCs w:val="24"/>
         </w:rPr>
-        <w:t>A – I find that a good interface is one that gives the most amount of information without taking too much space on the screen. Same games have so little that I have no idea what is going on and some games have so much I can hardly see the game behind it. Id like the game to have a good balance as is think information is very useful in this style of game.</w:t>
+        <w:t xml:space="preserve">A – I find that a good interface is one that gives the most amount of information without taking too much space on the screen. Same games have so little that I have no idea what is going on and some games have so much I can hardly see the game behind it. </w:t>
+      </w:r>
+      <w:r>
+        <w:rPr>
+          <w:sz w:val="24"/>
+          <w:szCs w:val="24"/>
+        </w:rPr>
+        <w:t>It must be very easy to see my health against the background.</w:t>
       </w:r>
     </w:p>
     <w:p>
@@ -867,14 +1050,47 @@
           <w:sz w:val="24"/>
           <w:szCs w:val="24"/>
         </w:rPr>
-        <w:t>From the client interview I now feel I have a better understanding of the game I am to create. I know where I am to draw inspiration from which gives me the ability to create a for of plan as to the direction I will take the game. The client has requested a good balance between speed and control of the player and wants the combat to feel difficult but manageable. To achieve this I understand I will have to put my game through many stages of testing both on my own and with the client to ensure the feel of th</w:t>
-      </w:r>
-      <w:r>
-        <w:rPr>
-          <w:sz w:val="24"/>
-          <w:szCs w:val="24"/>
-        </w:rPr>
-        <w:t>e game is right for them. The interview has also given some insight into how the game should look as the client gave details regarding the HUD (Head-Up Display) which will allow me to create an immersive but not overwhelming experience to the end user.</w:t>
+        <w:t xml:space="preserve">From the client interview I now feel I have a better understanding of the game I am to create. I know where I am to draw inspiration from which gives me the ability to create a </w:t>
+      </w:r>
+      <w:proofErr w:type="spellStart"/>
+      <w:r>
+        <w:rPr>
+          <w:sz w:val="24"/>
+          <w:szCs w:val="24"/>
+        </w:rPr>
+        <w:t>for</w:t>
+      </w:r>
+      <w:proofErr w:type="spellEnd"/>
+      <w:r>
+        <w:rPr>
+          <w:sz w:val="24"/>
+          <w:szCs w:val="24"/>
+        </w:rPr>
+        <w:t xml:space="preserve"> of plan as to the direction I will take the game. The client has requested a good balance between speed and control of the player and wants the combat to feel difficult but manageable. To achieve </w:t>
+      </w:r>
+      <w:proofErr w:type="gramStart"/>
+      <w:r>
+        <w:rPr>
+          <w:sz w:val="24"/>
+          <w:szCs w:val="24"/>
+        </w:rPr>
+        <w:t>this</w:t>
+      </w:r>
+      <w:proofErr w:type="gramEnd"/>
+      <w:r>
+        <w:rPr>
+          <w:sz w:val="24"/>
+          <w:szCs w:val="24"/>
+        </w:rPr>
+        <w:t xml:space="preserve"> I understand I will </w:t>
+      </w:r>
+      <w:r>
+        <w:rPr>
+          <w:sz w:val="24"/>
+          <w:szCs w:val="24"/>
+        </w:rPr>
+        <w:lastRenderedPageBreak/>
+        <w:t>have to put my game through many stages of testing both on my own and with the client to ensure the feel of the game is right for them. The interview has also given some insight into how the game should look as the client gave details regarding the HUD (Head-Up Display) which will allow me to create an immersive but not overwhelming experience to the end user.</w:t>
       </w:r>
     </w:p>
     <w:p>
@@ -1022,14 +1238,7 @@
           <w:sz w:val="24"/>
           <w:szCs w:val="24"/>
         </w:rPr>
-        <w:t xml:space="preserve">The player will be able to exit the </w:t>
-      </w:r>
-      <w:r>
-        <w:rPr>
-          <w:sz w:val="24"/>
-          <w:szCs w:val="24"/>
-        </w:rPr>
-        <w:t>game through this menu</w:t>
+        <w:t>The player will be able to exit the game through this menu</w:t>
       </w:r>
     </w:p>
     <w:p>
@@ -1189,14 +1398,7 @@
           <w:sz w:val="24"/>
           <w:szCs w:val="24"/>
         </w:rPr>
-        <w:t xml:space="preserve">The player will be kept constantly in the </w:t>
-      </w:r>
-      <w:r>
-        <w:rPr>
-          <w:sz w:val="24"/>
-          <w:szCs w:val="24"/>
-        </w:rPr>
-        <w:t>centre of the screen</w:t>
+        <w:t>The player will be kept constantly in the centre of the screen</w:t>
       </w:r>
     </w:p>
     <w:p>
@@ -1576,6 +1778,7 @@
           <w:sz w:val="24"/>
           <w:szCs w:val="24"/>
         </w:rPr>
+        <w:lastRenderedPageBreak/>
         <w:t>Different attacks and different enemies will be able to do different damages</w:t>
       </w:r>
     </w:p>
@@ -1676,7 +1879,6 @@
           <w:sz w:val="24"/>
           <w:szCs w:val="24"/>
         </w:rPr>
-        <w:lastRenderedPageBreak/>
         <w:t>When an enemy’s health is 0, the enemy will die and be removed from the screen</w:t>
       </w:r>
     </w:p>
@@ -1757,14 +1959,7 @@
           <w:sz w:val="24"/>
           <w:szCs w:val="24"/>
         </w:rPr>
-        <w:t xml:space="preserve">Provide a </w:t>
-      </w:r>
-      <w:r>
-        <w:rPr>
-          <w:sz w:val="24"/>
-          <w:szCs w:val="24"/>
-        </w:rPr>
-        <w:t>menu within the game which will pause the game behind it</w:t>
+        <w:t>Provide a menu within the game which will pause the game behind it</w:t>
       </w:r>
     </w:p>
     <w:p>
@@ -1844,14 +2039,7 @@
           <w:sz w:val="24"/>
           <w:szCs w:val="24"/>
         </w:rPr>
-        <w:t xml:space="preserve">The </w:t>
-      </w:r>
-      <w:r>
-        <w:rPr>
-          <w:sz w:val="24"/>
-          <w:szCs w:val="24"/>
-        </w:rPr>
-        <w:t>current game state will be saved to a file</w:t>
+        <w:t>The current game state will be saved to a file</w:t>
       </w:r>
     </w:p>
     <w:p>
@@ -2199,6 +2387,7 @@
           <w:sz w:val="24"/>
           <w:szCs w:val="24"/>
         </w:rPr>
+        <w:lastRenderedPageBreak/>
         <w:t>Class – A blueprint which contains properties and methods for a creatable object. Objects in my game will be created using classes.</w:t>
       </w:r>
     </w:p>
@@ -2215,14 +2404,7 @@
           <w:sz w:val="24"/>
           <w:szCs w:val="24"/>
         </w:rPr>
-        <w:t xml:space="preserve">Node – A node is an individual piece of a graph. Each node in my map grid will have a </w:t>
-      </w:r>
-      <w:r>
-        <w:rPr>
-          <w:sz w:val="24"/>
-          <w:szCs w:val="24"/>
-        </w:rPr>
-        <w:t>location and a list of its neighbours.</w:t>
+        <w:t>Node – A node is an individual piece of a graph. Each node in my map grid will have a location and a list of its neighbours.</w:t>
       </w:r>
     </w:p>
     <w:p>
@@ -2253,13 +2435,6 @@
           <w:szCs w:val="24"/>
         </w:rPr>
         <w:br/>
-      </w:r>
-      <w:r>
-        <w:rPr>
-          <w:sz w:val="24"/>
-          <w:szCs w:val="24"/>
-        </w:rPr>
-        <w:lastRenderedPageBreak/>
         <w:t>Camera – The ‘camera’ describes the graphical elements of the game currently displayed within the bounds of the game window. By using matrix multiplication and translation the camera can be centred on the players location.</w:t>
       </w:r>
     </w:p>
@@ -2554,16 +2729,7 @@
                 <w:sz w:val="24"/>
                 <w:szCs w:val="24"/>
               </w:rPr>
-              <w:t xml:space="preserve">1 + </w:t>
-            </w:r>
-            <w:r>
-              <w:rPr>
-                <w:rFonts w:ascii="Liberation Serif" w:hAnsi="Liberation Serif"/>
-                <w:color w:val="000000"/>
-                <w:sz w:val="24"/>
-                <w:szCs w:val="24"/>
-              </w:rPr>
-              <w:t>6.4</w:t>
+              <w:t>1 + 6.4</w:t>
             </w:r>
           </w:p>
         </w:tc>
@@ -3177,14 +3343,23 @@
           <w:sz w:val="24"/>
           <w:szCs w:val="24"/>
         </w:rPr>
-        <w:t xml:space="preserve">First the algorithm considers the enemies position. It then assigns each neighbouring node a value base on the total the cost to reach the node and the potential cost from that node to the end. The </w:t>
-      </w:r>
-      <w:r>
-        <w:rPr>
-          <w:sz w:val="24"/>
-          <w:szCs w:val="24"/>
-        </w:rPr>
-        <w:t>potential cost is calculated using Pythagoras’ formula.</w:t>
+        <w:t xml:space="preserve">First the algorithm considers the </w:t>
+      </w:r>
+      <w:proofErr w:type="gramStart"/>
+      <w:r>
+        <w:rPr>
+          <w:sz w:val="24"/>
+          <w:szCs w:val="24"/>
+        </w:rPr>
+        <w:t>enemies</w:t>
+      </w:r>
+      <w:proofErr w:type="gramEnd"/>
+      <w:r>
+        <w:rPr>
+          <w:sz w:val="24"/>
+          <w:szCs w:val="24"/>
+        </w:rPr>
+        <w:t xml:space="preserve"> position. It then assigns each neighbouring node a value base on the total the cost to reach the node and the potential cost from that node to the end. The potential cost is calculated using Pythagoras’ formula.</w:t>
       </w:r>
       <w:r>
         <w:rPr>
@@ -4093,15 +4268,7 @@
           <w:sz w:val="24"/>
           <w:szCs w:val="24"/>
         </w:rPr>
-        <w:lastRenderedPageBreak/>
-        <w:t xml:space="preserve">It then considers the next node which has the lowest value and considers the cost to all </w:t>
-      </w:r>
-      <w:r>
-        <w:rPr>
-          <w:sz w:val="24"/>
-          <w:szCs w:val="24"/>
-        </w:rPr>
-        <w:t>of its neighbours. It also updates the cost of already checked nodes if the cost through the current node is cheaper.</w:t>
+        <w:t>It then considers the next node which has the lowest value and considers the cost to all of its neighbours. It also updates the cost of already checked nodes if the cost through the current node is cheaper.</w:t>
       </w:r>
     </w:p>
     <w:p>
@@ -5054,14 +5221,7 @@
           <w:sz w:val="24"/>
           <w:szCs w:val="24"/>
         </w:rPr>
-        <w:t>By considering each node in this way the algorithm will eventually reach the node at which the player is on and have a complete list of nodes which form the optimal route. This algorithm is efficient as it considers the potential cost of a node which reduces the need to check each node and ensures the nodes being checked are in the direction of the target. However, by also considering the current cost to a node it prevents the algorithm</w:t>
-      </w:r>
-      <w:r>
-        <w:rPr>
-          <w:sz w:val="24"/>
-          <w:szCs w:val="24"/>
-        </w:rPr>
-        <w:t xml:space="preserve"> finding a sub-optimal path by heading directly to the target into an obstruction.</w:t>
+        <w:t>By considering each node in this way the algorithm will eventually reach the node at which the player is on and have a complete list of nodes which form the optimal route. This algorithm is efficient as it considers the potential cost of a node which reduces the need to check each node and ensures the nodes being checked are in the direction of the target. However, by also considering the current cost to a node it prevents the algorithm finding a sub-optimal path by heading directly to the target into an obstruction.</w:t>
       </w:r>
     </w:p>
     <w:p>

</xml_diff>

<commit_message>
work on paperwork and iffy working coridors. YIPPEE!!!!
</commit_message>
<xml_diff>
--- a/NEA Paperwork HP.docx
+++ b/NEA Paperwork HP.docx
@@ -59,8 +59,16 @@
           <w:pPr>
             <w:pStyle w:val="TOC1"/>
             <w:tabs>
-              <w:tab w:val="right" w:leader="dot" w:pos="10465"/>
+              <w:tab w:val="right" w:leader="dot" w:pos="10456"/>
             </w:tabs>
+            <w:rPr>
+              <w:noProof/>
+              <w:kern w:val="2"/>
+              <w:sz w:val="24"/>
+              <w:szCs w:val="24"/>
+              <w:lang w:eastAsia="en-GB"/>
+              <w14:ligatures w14:val="standardContextual"/>
+            </w:rPr>
           </w:pPr>
           <w:r>
             <w:fldChar w:fldCharType="begin"/>
@@ -77,91 +85,734 @@
             </w:rPr>
             <w:fldChar w:fldCharType="separate"/>
           </w:r>
-          <w:r>
-            <w:rPr>
-              <w:rStyle w:val="IndexLink"/>
-            </w:rPr>
-            <w:t>Analysis</w:t>
-          </w:r>
-          <w:r>
-            <w:tab/>
-            <w:t>2</w:t>
-          </w:r>
+          <w:hyperlink w:anchor="_Toc239941469" w:history="1">
+            <w:r>
+              <w:rPr>
+                <w:rStyle w:val="Hyperlink"/>
+                <w:noProof/>
+              </w:rPr>
+              <w:t>Analysis</w:t>
+            </w:r>
+            <w:r>
+              <w:rPr>
+                <w:noProof/>
+                <w:webHidden/>
+              </w:rPr>
+              <w:tab/>
+            </w:r>
+            <w:r>
+              <w:rPr>
+                <w:noProof/>
+                <w:webHidden/>
+              </w:rPr>
+              <w:fldChar w:fldCharType="begin"/>
+            </w:r>
+            <w:r>
+              <w:rPr>
+                <w:noProof/>
+                <w:webHidden/>
+              </w:rPr>
+              <w:instrText xml:space="preserve"> PAGEREF _Toc239941469 \h </w:instrText>
+            </w:r>
+            <w:r>
+              <w:rPr>
+                <w:noProof/>
+                <w:webHidden/>
+              </w:rPr>
+            </w:r>
+            <w:r>
+              <w:rPr>
+                <w:noProof/>
+                <w:webHidden/>
+              </w:rPr>
+              <w:fldChar w:fldCharType="separate"/>
+            </w:r>
+            <w:r>
+              <w:rPr>
+                <w:noProof/>
+                <w:webHidden/>
+              </w:rPr>
+              <w:t>2</w:t>
+            </w:r>
+            <w:r>
+              <w:rPr>
+                <w:noProof/>
+                <w:webHidden/>
+              </w:rPr>
+              <w:fldChar w:fldCharType="end"/>
+            </w:r>
+          </w:hyperlink>
         </w:p>
         <w:p>
           <w:pPr>
             <w:pStyle w:val="TOC2"/>
             <w:tabs>
-              <w:tab w:val="right" w:leader="dot" w:pos="10465"/>
+              <w:tab w:val="right" w:leader="dot" w:pos="10456"/>
             </w:tabs>
+            <w:rPr>
+              <w:noProof/>
+              <w:kern w:val="2"/>
+              <w:sz w:val="24"/>
+              <w:szCs w:val="24"/>
+              <w:lang w:eastAsia="en-GB"/>
+              <w14:ligatures w14:val="standardContextual"/>
+            </w:rPr>
           </w:pPr>
-          <w:r>
-            <w:t>Project Background</w:t>
-          </w:r>
-          <w:r>
-            <w:tab/>
-            <w:t>2</w:t>
-          </w:r>
+          <w:hyperlink w:anchor="_Toc239941470" w:history="1">
+            <w:r>
+              <w:rPr>
+                <w:rStyle w:val="Hyperlink"/>
+                <w:noProof/>
+              </w:rPr>
+              <w:t>Project Background</w:t>
+            </w:r>
+            <w:r>
+              <w:rPr>
+                <w:noProof/>
+                <w:webHidden/>
+              </w:rPr>
+              <w:tab/>
+            </w:r>
+            <w:r>
+              <w:rPr>
+                <w:noProof/>
+                <w:webHidden/>
+              </w:rPr>
+              <w:fldChar w:fldCharType="begin"/>
+            </w:r>
+            <w:r>
+              <w:rPr>
+                <w:noProof/>
+                <w:webHidden/>
+              </w:rPr>
+              <w:instrText xml:space="preserve"> PAGEREF _Toc239941470 \h </w:instrText>
+            </w:r>
+            <w:r>
+              <w:rPr>
+                <w:noProof/>
+                <w:webHidden/>
+              </w:rPr>
+            </w:r>
+            <w:r>
+              <w:rPr>
+                <w:noProof/>
+                <w:webHidden/>
+              </w:rPr>
+              <w:fldChar w:fldCharType="separate"/>
+            </w:r>
+            <w:r>
+              <w:rPr>
+                <w:noProof/>
+                <w:webHidden/>
+              </w:rPr>
+              <w:t>2</w:t>
+            </w:r>
+            <w:r>
+              <w:rPr>
+                <w:noProof/>
+                <w:webHidden/>
+              </w:rPr>
+              <w:fldChar w:fldCharType="end"/>
+            </w:r>
+          </w:hyperlink>
         </w:p>
         <w:p>
           <w:pPr>
             <w:pStyle w:val="TOC2"/>
             <w:tabs>
-              <w:tab w:val="right" w:leader="dot" w:pos="10465"/>
+              <w:tab w:val="right" w:leader="dot" w:pos="10456"/>
             </w:tabs>
+            <w:rPr>
+              <w:noProof/>
+              <w:kern w:val="2"/>
+              <w:sz w:val="24"/>
+              <w:szCs w:val="24"/>
+              <w:lang w:eastAsia="en-GB"/>
+              <w14:ligatures w14:val="standardContextual"/>
+            </w:rPr>
           </w:pPr>
-          <w:r>
-            <w:t>Client Interview</w:t>
-          </w:r>
-          <w:r>
-            <w:tab/>
-            <w:t>2</w:t>
-          </w:r>
+          <w:hyperlink w:anchor="_Toc239941471" w:history="1">
+            <w:r>
+              <w:rPr>
+                <w:rStyle w:val="Hyperlink"/>
+                <w:noProof/>
+              </w:rPr>
+              <w:t>Client Interview</w:t>
+            </w:r>
+            <w:r>
+              <w:rPr>
+                <w:noProof/>
+                <w:webHidden/>
+              </w:rPr>
+              <w:tab/>
+            </w:r>
+            <w:r>
+              <w:rPr>
+                <w:noProof/>
+                <w:webHidden/>
+              </w:rPr>
+              <w:fldChar w:fldCharType="begin"/>
+            </w:r>
+            <w:r>
+              <w:rPr>
+                <w:noProof/>
+                <w:webHidden/>
+              </w:rPr>
+              <w:instrText xml:space="preserve"> PAGEREF _Toc239941471 \h </w:instrText>
+            </w:r>
+            <w:r>
+              <w:rPr>
+                <w:noProof/>
+                <w:webHidden/>
+              </w:rPr>
+            </w:r>
+            <w:r>
+              <w:rPr>
+                <w:noProof/>
+                <w:webHidden/>
+              </w:rPr>
+              <w:fldChar w:fldCharType="separate"/>
+            </w:r>
+            <w:r>
+              <w:rPr>
+                <w:noProof/>
+                <w:webHidden/>
+              </w:rPr>
+              <w:t>2</w:t>
+            </w:r>
+            <w:r>
+              <w:rPr>
+                <w:noProof/>
+                <w:webHidden/>
+              </w:rPr>
+              <w:fldChar w:fldCharType="end"/>
+            </w:r>
+          </w:hyperlink>
         </w:p>
         <w:p>
           <w:pPr>
             <w:pStyle w:val="TOC2"/>
             <w:tabs>
-              <w:tab w:val="right" w:leader="dot" w:pos="10465"/>
+              <w:tab w:val="right" w:leader="dot" w:pos="10456"/>
             </w:tabs>
+            <w:rPr>
+              <w:noProof/>
+              <w:kern w:val="2"/>
+              <w:sz w:val="24"/>
+              <w:szCs w:val="24"/>
+              <w:lang w:eastAsia="en-GB"/>
+              <w14:ligatures w14:val="standardContextual"/>
+            </w:rPr>
           </w:pPr>
-          <w:r>
-            <w:t>Reflections of Client Interview</w:t>
-          </w:r>
-          <w:r>
-            <w:tab/>
-            <w:t>3</w:t>
-          </w:r>
+          <w:hyperlink w:anchor="_Toc239941472" w:history="1">
+            <w:r>
+              <w:rPr>
+                <w:rStyle w:val="Hyperlink"/>
+                <w:noProof/>
+              </w:rPr>
+              <w:t>Reflections of Client Interview</w:t>
+            </w:r>
+            <w:r>
+              <w:rPr>
+                <w:noProof/>
+                <w:webHidden/>
+              </w:rPr>
+              <w:tab/>
+            </w:r>
+            <w:r>
+              <w:rPr>
+                <w:noProof/>
+                <w:webHidden/>
+              </w:rPr>
+              <w:fldChar w:fldCharType="begin"/>
+            </w:r>
+            <w:r>
+              <w:rPr>
+                <w:noProof/>
+                <w:webHidden/>
+              </w:rPr>
+              <w:instrText xml:space="preserve"> PAGEREF _Toc239941472 \h </w:instrText>
+            </w:r>
+            <w:r>
+              <w:rPr>
+                <w:noProof/>
+                <w:webHidden/>
+              </w:rPr>
+            </w:r>
+            <w:r>
+              <w:rPr>
+                <w:noProof/>
+                <w:webHidden/>
+              </w:rPr>
+              <w:fldChar w:fldCharType="separate"/>
+            </w:r>
+            <w:r>
+              <w:rPr>
+                <w:noProof/>
+                <w:webHidden/>
+              </w:rPr>
+              <w:t>3</w:t>
+            </w:r>
+            <w:r>
+              <w:rPr>
+                <w:noProof/>
+                <w:webHidden/>
+              </w:rPr>
+              <w:fldChar w:fldCharType="end"/>
+            </w:r>
+          </w:hyperlink>
         </w:p>
         <w:p>
           <w:pPr>
             <w:pStyle w:val="TOC2"/>
             <w:tabs>
-              <w:tab w:val="right" w:leader="dot" w:pos="10465"/>
+              <w:tab w:val="right" w:leader="dot" w:pos="10456"/>
             </w:tabs>
+            <w:rPr>
+              <w:noProof/>
+              <w:kern w:val="2"/>
+              <w:sz w:val="24"/>
+              <w:szCs w:val="24"/>
+              <w:lang w:eastAsia="en-GB"/>
+              <w14:ligatures w14:val="standardContextual"/>
+            </w:rPr>
           </w:pPr>
-          <w:r>
-            <w:t>Objectives</w:t>
-          </w:r>
-          <w:r>
-            <w:tab/>
-            <w:t>3</w:t>
-          </w:r>
+          <w:hyperlink w:anchor="_Toc239941473" w:history="1">
+            <w:r>
+              <w:rPr>
+                <w:rStyle w:val="Hyperlink"/>
+                <w:noProof/>
+              </w:rPr>
+              <w:t>Objectives</w:t>
+            </w:r>
+            <w:r>
+              <w:rPr>
+                <w:noProof/>
+                <w:webHidden/>
+              </w:rPr>
+              <w:tab/>
+            </w:r>
+            <w:r>
+              <w:rPr>
+                <w:noProof/>
+                <w:webHidden/>
+              </w:rPr>
+              <w:fldChar w:fldCharType="begin"/>
+            </w:r>
+            <w:r>
+              <w:rPr>
+                <w:noProof/>
+                <w:webHidden/>
+              </w:rPr>
+              <w:instrText xml:space="preserve"> PAGEREF _Toc239941473 \h </w:instrText>
+            </w:r>
+            <w:r>
+              <w:rPr>
+                <w:noProof/>
+                <w:webHidden/>
+              </w:rPr>
+            </w:r>
+            <w:r>
+              <w:rPr>
+                <w:noProof/>
+                <w:webHidden/>
+              </w:rPr>
+              <w:fldChar w:fldCharType="separate"/>
+            </w:r>
+            <w:r>
+              <w:rPr>
+                <w:noProof/>
+                <w:webHidden/>
+              </w:rPr>
+              <w:t>4</w:t>
+            </w:r>
+            <w:r>
+              <w:rPr>
+                <w:noProof/>
+                <w:webHidden/>
+              </w:rPr>
+              <w:fldChar w:fldCharType="end"/>
+            </w:r>
+          </w:hyperlink>
         </w:p>
         <w:p>
           <w:pPr>
             <w:pStyle w:val="TOC2"/>
             <w:tabs>
-              <w:tab w:val="right" w:leader="dot" w:pos="10465"/>
+              <w:tab w:val="right" w:leader="dot" w:pos="10456"/>
             </w:tabs>
+            <w:rPr>
+              <w:noProof/>
+              <w:kern w:val="2"/>
+              <w:sz w:val="24"/>
+              <w:szCs w:val="24"/>
+              <w:lang w:eastAsia="en-GB"/>
+              <w14:ligatures w14:val="standardContextual"/>
+            </w:rPr>
           </w:pPr>
-          <w:r>
-            <w:t>Modelling</w:t>
-          </w:r>
-          <w:r>
-            <w:tab/>
-            <w:t>5</w:t>
-          </w:r>
+          <w:hyperlink w:anchor="_Toc239941474" w:history="1">
+            <w:r>
+              <w:rPr>
+                <w:rStyle w:val="Hyperlink"/>
+                <w:noProof/>
+              </w:rPr>
+              <w:t>Modelli</w:t>
+            </w:r>
+            <w:r>
+              <w:rPr>
+                <w:rStyle w:val="Hyperlink"/>
+                <w:noProof/>
+              </w:rPr>
+              <w:t>n</w:t>
+            </w:r>
+            <w:r>
+              <w:rPr>
+                <w:rStyle w:val="Hyperlink"/>
+                <w:noProof/>
+              </w:rPr>
+              <w:t>g</w:t>
+            </w:r>
+            <w:r>
+              <w:rPr>
+                <w:noProof/>
+                <w:webHidden/>
+              </w:rPr>
+              <w:tab/>
+            </w:r>
+            <w:r>
+              <w:rPr>
+                <w:noProof/>
+                <w:webHidden/>
+              </w:rPr>
+              <w:fldChar w:fldCharType="begin"/>
+            </w:r>
+            <w:r>
+              <w:rPr>
+                <w:noProof/>
+                <w:webHidden/>
+              </w:rPr>
+              <w:instrText xml:space="preserve"> PAGEREF _Toc239941474 \h </w:instrText>
+            </w:r>
+            <w:r>
+              <w:rPr>
+                <w:noProof/>
+                <w:webHidden/>
+              </w:rPr>
+            </w:r>
+            <w:r>
+              <w:rPr>
+                <w:noProof/>
+                <w:webHidden/>
+              </w:rPr>
+              <w:fldChar w:fldCharType="separate"/>
+            </w:r>
+            <w:r>
+              <w:rPr>
+                <w:noProof/>
+                <w:webHidden/>
+              </w:rPr>
+              <w:t>6</w:t>
+            </w:r>
+            <w:r>
+              <w:rPr>
+                <w:noProof/>
+                <w:webHidden/>
+              </w:rPr>
+              <w:fldChar w:fldCharType="end"/>
+            </w:r>
+          </w:hyperlink>
+        </w:p>
+        <w:p>
+          <w:pPr>
+            <w:pStyle w:val="TOC1"/>
+            <w:tabs>
+              <w:tab w:val="right" w:leader="dot" w:pos="10456"/>
+            </w:tabs>
+            <w:rPr>
+              <w:noProof/>
+              <w:kern w:val="2"/>
+              <w:sz w:val="24"/>
+              <w:szCs w:val="24"/>
+              <w:lang w:eastAsia="en-GB"/>
+              <w14:ligatures w14:val="standardContextual"/>
+            </w:rPr>
+          </w:pPr>
+          <w:hyperlink w:anchor="_Toc239941475" w:history="1">
+            <w:r>
+              <w:rPr>
+                <w:rStyle w:val="Hyperlink"/>
+                <w:noProof/>
+              </w:rPr>
+              <w:t>Design</w:t>
+            </w:r>
+            <w:r>
+              <w:rPr>
+                <w:noProof/>
+                <w:webHidden/>
+              </w:rPr>
+              <w:tab/>
+            </w:r>
+            <w:r>
+              <w:rPr>
+                <w:noProof/>
+                <w:webHidden/>
+              </w:rPr>
+              <w:fldChar w:fldCharType="begin"/>
+            </w:r>
+            <w:r>
+              <w:rPr>
+                <w:noProof/>
+                <w:webHidden/>
+              </w:rPr>
+              <w:instrText xml:space="preserve"> PAGEREF _Toc239941475 \h </w:instrText>
+            </w:r>
+            <w:r>
+              <w:rPr>
+                <w:noProof/>
+                <w:webHidden/>
+              </w:rPr>
+            </w:r>
+            <w:r>
+              <w:rPr>
+                <w:noProof/>
+                <w:webHidden/>
+              </w:rPr>
+              <w:fldChar w:fldCharType="separate"/>
+            </w:r>
+            <w:r>
+              <w:rPr>
+                <w:noProof/>
+                <w:webHidden/>
+              </w:rPr>
+              <w:t>10</w:t>
+            </w:r>
+            <w:r>
+              <w:rPr>
+                <w:noProof/>
+                <w:webHidden/>
+              </w:rPr>
+              <w:fldChar w:fldCharType="end"/>
+            </w:r>
+          </w:hyperlink>
+        </w:p>
+        <w:p>
+          <w:pPr>
+            <w:pStyle w:val="TOC1"/>
+            <w:tabs>
+              <w:tab w:val="right" w:leader="dot" w:pos="10456"/>
+            </w:tabs>
+            <w:rPr>
+              <w:noProof/>
+              <w:kern w:val="2"/>
+              <w:sz w:val="24"/>
+              <w:szCs w:val="24"/>
+              <w:lang w:eastAsia="en-GB"/>
+              <w14:ligatures w14:val="standardContextual"/>
+            </w:rPr>
+          </w:pPr>
+          <w:hyperlink w:anchor="_Toc239941476" w:history="1">
+            <w:r>
+              <w:rPr>
+                <w:rStyle w:val="Hyperlink"/>
+                <w:noProof/>
+              </w:rPr>
+              <w:t>Technical solution</w:t>
+            </w:r>
+            <w:r>
+              <w:rPr>
+                <w:noProof/>
+                <w:webHidden/>
+              </w:rPr>
+              <w:tab/>
+            </w:r>
+            <w:r>
+              <w:rPr>
+                <w:noProof/>
+                <w:webHidden/>
+              </w:rPr>
+              <w:fldChar w:fldCharType="begin"/>
+            </w:r>
+            <w:r>
+              <w:rPr>
+                <w:noProof/>
+                <w:webHidden/>
+              </w:rPr>
+              <w:instrText xml:space="preserve"> PAGEREF _Toc239941476 \h </w:instrText>
+            </w:r>
+            <w:r>
+              <w:rPr>
+                <w:noProof/>
+                <w:webHidden/>
+              </w:rPr>
+            </w:r>
+            <w:r>
+              <w:rPr>
+                <w:noProof/>
+                <w:webHidden/>
+              </w:rPr>
+              <w:fldChar w:fldCharType="separate"/>
+            </w:r>
+            <w:r>
+              <w:rPr>
+                <w:noProof/>
+                <w:webHidden/>
+              </w:rPr>
+              <w:t>10</w:t>
+            </w:r>
+            <w:r>
+              <w:rPr>
+                <w:noProof/>
+                <w:webHidden/>
+              </w:rPr>
+              <w:fldChar w:fldCharType="end"/>
+            </w:r>
+          </w:hyperlink>
+        </w:p>
+        <w:p>
+          <w:pPr>
+            <w:pStyle w:val="TOC1"/>
+            <w:tabs>
+              <w:tab w:val="right" w:leader="dot" w:pos="10456"/>
+            </w:tabs>
+            <w:rPr>
+              <w:noProof/>
+              <w:kern w:val="2"/>
+              <w:sz w:val="24"/>
+              <w:szCs w:val="24"/>
+              <w:lang w:eastAsia="en-GB"/>
+              <w14:ligatures w14:val="standardContextual"/>
+            </w:rPr>
+          </w:pPr>
+          <w:hyperlink w:anchor="_Toc239941477" w:history="1">
+            <w:r>
+              <w:rPr>
+                <w:rStyle w:val="Hyperlink"/>
+                <w:noProof/>
+              </w:rPr>
+              <w:t>Testing</w:t>
+            </w:r>
+            <w:r>
+              <w:rPr>
+                <w:noProof/>
+                <w:webHidden/>
+              </w:rPr>
+              <w:tab/>
+            </w:r>
+            <w:r>
+              <w:rPr>
+                <w:noProof/>
+                <w:webHidden/>
+              </w:rPr>
+              <w:fldChar w:fldCharType="begin"/>
+            </w:r>
+            <w:r>
+              <w:rPr>
+                <w:noProof/>
+                <w:webHidden/>
+              </w:rPr>
+              <w:instrText xml:space="preserve"> PAGEREF _Toc239941477 \h </w:instrText>
+            </w:r>
+            <w:r>
+              <w:rPr>
+                <w:noProof/>
+                <w:webHidden/>
+              </w:rPr>
+            </w:r>
+            <w:r>
+              <w:rPr>
+                <w:noProof/>
+                <w:webHidden/>
+              </w:rPr>
+              <w:fldChar w:fldCharType="separate"/>
+            </w:r>
+            <w:r>
+              <w:rPr>
+                <w:noProof/>
+                <w:webHidden/>
+              </w:rPr>
+              <w:t>10</w:t>
+            </w:r>
+            <w:r>
+              <w:rPr>
+                <w:noProof/>
+                <w:webHidden/>
+              </w:rPr>
+              <w:fldChar w:fldCharType="end"/>
+            </w:r>
+          </w:hyperlink>
+        </w:p>
+        <w:p>
+          <w:pPr>
+            <w:pStyle w:val="TOC1"/>
+            <w:tabs>
+              <w:tab w:val="right" w:leader="dot" w:pos="10456"/>
+            </w:tabs>
+            <w:rPr>
+              <w:noProof/>
+              <w:kern w:val="2"/>
+              <w:sz w:val="24"/>
+              <w:szCs w:val="24"/>
+              <w:lang w:eastAsia="en-GB"/>
+              <w14:ligatures w14:val="standardContextual"/>
+            </w:rPr>
+          </w:pPr>
+          <w:hyperlink w:anchor="_Toc239941478" w:history="1">
+            <w:r>
+              <w:rPr>
+                <w:rStyle w:val="Hyperlink"/>
+                <w:noProof/>
+              </w:rPr>
+              <w:t>Evaluation</w:t>
+            </w:r>
+            <w:r>
+              <w:rPr>
+                <w:noProof/>
+                <w:webHidden/>
+              </w:rPr>
+              <w:tab/>
+            </w:r>
+            <w:r>
+              <w:rPr>
+                <w:noProof/>
+                <w:webHidden/>
+              </w:rPr>
+              <w:fldChar w:fldCharType="begin"/>
+            </w:r>
+            <w:r>
+              <w:rPr>
+                <w:noProof/>
+                <w:webHidden/>
+              </w:rPr>
+              <w:instrText xml:space="preserve"> PAGEREF _Toc239941478 \h </w:instrText>
+            </w:r>
+            <w:r>
+              <w:rPr>
+                <w:noProof/>
+                <w:webHidden/>
+              </w:rPr>
+            </w:r>
+            <w:r>
+              <w:rPr>
+                <w:noProof/>
+                <w:webHidden/>
+              </w:rPr>
+              <w:fldChar w:fldCharType="separate"/>
+            </w:r>
+            <w:r>
+              <w:rPr>
+                <w:noProof/>
+                <w:webHidden/>
+              </w:rPr>
+              <w:t>10</w:t>
+            </w:r>
+            <w:r>
+              <w:rPr>
+                <w:noProof/>
+                <w:webHidden/>
+              </w:rPr>
+              <w:fldChar w:fldCharType="end"/>
+            </w:r>
+          </w:hyperlink>
         </w:p>
         <w:p>
           <w:pPr>
@@ -171,58 +822,6 @@
             </w:tabs>
           </w:pPr>
           <w:r>
-            <w:t>Design</w:t>
-          </w:r>
-          <w:r>
-            <w:tab/>
-            <w:t>7</w:t>
-          </w:r>
-        </w:p>
-        <w:p>
-          <w:pPr>
-            <w:pStyle w:val="TOC1"/>
-            <w:tabs>
-              <w:tab w:val="right" w:leader="dot" w:pos="10465"/>
-            </w:tabs>
-          </w:pPr>
-          <w:r>
-            <w:t>Technical solution</w:t>
-          </w:r>
-          <w:r>
-            <w:tab/>
-            <w:t>7</w:t>
-          </w:r>
-        </w:p>
-        <w:p>
-          <w:pPr>
-            <w:pStyle w:val="TOC1"/>
-            <w:tabs>
-              <w:tab w:val="right" w:leader="dot" w:pos="10465"/>
-            </w:tabs>
-          </w:pPr>
-          <w:r>
-            <w:t>Testing</w:t>
-          </w:r>
-          <w:r>
-            <w:tab/>
-            <w:t>7</w:t>
-          </w:r>
-        </w:p>
-        <w:p>
-          <w:pPr>
-            <w:pStyle w:val="TOC1"/>
-            <w:tabs>
-              <w:tab w:val="right" w:leader="dot" w:pos="10465"/>
-            </w:tabs>
-          </w:pPr>
-          <w:r>
-            <w:t>Evaluation</w:t>
-          </w:r>
-          <w:r>
-            <w:tab/>
-            <w:t>7</w:t>
-          </w:r>
-          <w:r>
             <w:fldChar w:fldCharType="end"/>
           </w:r>
         </w:p>
@@ -262,17 +861,18 @@
       <w:bookmarkStart w:id="0" w:name="__RefHeading___Toc1033_50594169"/>
       <w:bookmarkStart w:id="1" w:name="_Toc229035136"/>
       <w:bookmarkStart w:id="2" w:name="_Toc222817101"/>
+      <w:bookmarkStart w:id="3" w:name="_Toc239941469"/>
       <w:bookmarkEnd w:id="0"/>
       <w:r>
         <w:rPr>
           <w:sz w:val="50"/>
           <w:szCs w:val="50"/>
         </w:rPr>
-        <w:lastRenderedPageBreak/>
         <w:t>Analysis</w:t>
       </w:r>
       <w:bookmarkEnd w:id="1"/>
       <w:bookmarkEnd w:id="2"/>
+      <w:bookmarkEnd w:id="3"/>
     </w:p>
     <w:p/>
     <w:p>
@@ -283,10 +883,11 @@
           <w:szCs w:val="40"/>
         </w:rPr>
       </w:pPr>
-      <w:bookmarkStart w:id="3" w:name="__RefHeading___Toc1035_50594169"/>
-      <w:bookmarkStart w:id="4" w:name="_Toc229035137"/>
-      <w:bookmarkStart w:id="5" w:name="_Toc222817102"/>
-      <w:bookmarkEnd w:id="3"/>
+      <w:bookmarkStart w:id="4" w:name="__RefHeading___Toc1035_50594169"/>
+      <w:bookmarkStart w:id="5" w:name="_Toc229035137"/>
+      <w:bookmarkStart w:id="6" w:name="_Toc222817102"/>
+      <w:bookmarkStart w:id="7" w:name="_Toc239941470"/>
+      <w:bookmarkEnd w:id="4"/>
       <w:r>
         <w:rPr>
           <w:sz w:val="40"/>
@@ -294,8 +895,9 @@
         </w:rPr>
         <w:t>Project Background</w:t>
       </w:r>
-      <w:bookmarkEnd w:id="4"/>
       <w:bookmarkEnd w:id="5"/>
+      <w:bookmarkEnd w:id="6"/>
+      <w:bookmarkEnd w:id="7"/>
     </w:p>
     <w:p>
       <w:pPr>
@@ -376,23 +978,7 @@
           <w:sz w:val="24"/>
           <w:szCs w:val="24"/>
         </w:rPr>
-        <w:t xml:space="preserve">I have chosen this as my project as I am interested in game development and would like to expand my knowledge of the techniques used by creating my own game. Through my research for my </w:t>
-      </w:r>
-      <w:proofErr w:type="gramStart"/>
-      <w:r>
-        <w:rPr>
-          <w:sz w:val="24"/>
-          <w:szCs w:val="24"/>
-        </w:rPr>
-        <w:t>NEA</w:t>
-      </w:r>
-      <w:proofErr w:type="gramEnd"/>
-      <w:r>
-        <w:rPr>
-          <w:sz w:val="24"/>
-          <w:szCs w:val="24"/>
-        </w:rPr>
-        <w:t xml:space="preserve"> I will hopefully learn how video games are created by large companies and also pick up some skills which may become useful in my future.</w:t>
+        <w:t>I have chosen this as my project as I am interested in game development and would like to expand my knowledge of the techniques used by creating my own game. Through my research for my NEA I will hopefully learn how video games are created by large companies and also pick up some skills which may become useful in my future.</w:t>
       </w:r>
     </w:p>
     <w:p>
@@ -421,10 +1007,11 @@
           <w:szCs w:val="40"/>
         </w:rPr>
       </w:pPr>
-      <w:bookmarkStart w:id="6" w:name="__RefHeading___Toc1037_50594169"/>
-      <w:bookmarkStart w:id="7" w:name="_Toc229035138"/>
-      <w:bookmarkStart w:id="8" w:name="_Toc222817103"/>
-      <w:bookmarkEnd w:id="6"/>
+      <w:bookmarkStart w:id="8" w:name="__RefHeading___Toc1037_50594169"/>
+      <w:bookmarkStart w:id="9" w:name="_Toc229035138"/>
+      <w:bookmarkStart w:id="10" w:name="_Toc222817103"/>
+      <w:bookmarkStart w:id="11" w:name="_Toc239941471"/>
+      <w:bookmarkEnd w:id="8"/>
       <w:r>
         <w:rPr>
           <w:sz w:val="40"/>
@@ -432,8 +1019,9 @@
         </w:rPr>
         <w:t>Client Interview</w:t>
       </w:r>
-      <w:bookmarkEnd w:id="7"/>
-      <w:bookmarkEnd w:id="8"/>
+      <w:bookmarkEnd w:id="9"/>
+      <w:bookmarkEnd w:id="10"/>
+      <w:bookmarkEnd w:id="11"/>
     </w:p>
     <w:p>
       <w:pPr>
@@ -464,7 +1052,7 @@
           <w:sz w:val="24"/>
           <w:szCs w:val="24"/>
         </w:rPr>
-        <w:t>For my interview I will talk to Leo (17), a student in my school who has 2000+ hours of gameplay in the roguelike genre. I feel that asking questions to the intended audience will be the best way to gauge what is wanted from my project by potential players. Leo will be really useful to me as he has lots of experience. This interview will assist me in tailoring my design to the needs of the player and will give me an insight into this genre.</w:t>
+        <w:t>For my interview I will talk to Leo, a student in my school who has 2000+ hours of gameplay in the roguelike genre. I feel that asking questions to the intended audience will be the best way to gauge what is wanted from my project by potential players. Leo will be really useful to me as he has lots of experience. This interview will assist me in tailoring my design to the needs of the player and will give me an insight into this genre.</w:t>
       </w:r>
     </w:p>
     <w:p>
@@ -509,51 +1097,16 @@
           <w:sz w:val="24"/>
           <w:szCs w:val="24"/>
         </w:rPr>
-        <w:t>A – I currently play games such as ’The Binding of Isaac’, ‘</w:t>
-      </w:r>
-      <w:proofErr w:type="spellStart"/>
-      <w:r>
-        <w:rPr>
-          <w:sz w:val="24"/>
-          <w:szCs w:val="24"/>
-        </w:rPr>
-        <w:t>Mewgenics</w:t>
-      </w:r>
-      <w:proofErr w:type="spellEnd"/>
-      <w:r>
-        <w:rPr>
-          <w:sz w:val="24"/>
-          <w:szCs w:val="24"/>
-        </w:rPr>
-        <w:t xml:space="preserve">’ and ‘Hades’. I feel like these games do aspects of the roguelike genre really well. For example, ‘The Binding of Isaac’ uses a system which creates new attacks based on the combinations of equipped items. This keeps the game interesting to the player as it creates unexpected effects. </w:t>
-      </w:r>
-    </w:p>
-    <w:p>
-      <w:pPr>
-        <w:jc w:val="center"/>
-        <w:rPr>
-          <w:sz w:val="24"/>
-          <w:szCs w:val="24"/>
-        </w:rPr>
-      </w:pPr>
-    </w:p>
-    <w:p>
-      <w:pPr>
-        <w:jc w:val="center"/>
-        <w:rPr>
-          <w:sz w:val="24"/>
-          <w:szCs w:val="24"/>
-        </w:rPr>
-      </w:pPr>
-    </w:p>
-    <w:p>
-      <w:pPr>
-        <w:jc w:val="center"/>
-        <w:rPr>
-          <w:sz w:val="24"/>
-          <w:szCs w:val="24"/>
-        </w:rPr>
-      </w:pPr>
+        <w:t xml:space="preserve">A – I currently play games such as ’The Binding of Isaac’, ‘Mewgenics’ and ‘Hades’. I feel like these games do aspects of the roguelike genre really well. For example, ‘The Binding of Isaac’ uses a system </w:t>
+      </w:r>
+      <w:r>
+        <w:rPr>
+          <w:sz w:val="24"/>
+          <w:szCs w:val="24"/>
+        </w:rPr>
+        <w:lastRenderedPageBreak/>
+        <w:t xml:space="preserve">which creates new attacks based on the combinations of equipped items. This keeps the game interesting to the player as it creates unexpected effects. </w:t>
+      </w:r>
     </w:p>
     <w:p>
       <w:pPr>
@@ -588,30 +1141,7 @@
           <w:sz w:val="24"/>
           <w:szCs w:val="24"/>
         </w:rPr>
-        <w:t xml:space="preserve">A – I think the enemies should feel like a challenge to face in combat but should not be so difficult as to </w:t>
-      </w:r>
-      <w:r>
-        <w:rPr>
-          <w:sz w:val="24"/>
-          <w:szCs w:val="24"/>
-        </w:rPr>
-        <w:t xml:space="preserve">overwhelm the player. I enjoy having to learn the attacks of each enemy as it feels like each </w:t>
-      </w:r>
-      <w:proofErr w:type="gramStart"/>
-      <w:r>
-        <w:rPr>
-          <w:sz w:val="24"/>
-          <w:szCs w:val="24"/>
-        </w:rPr>
-        <w:t>run</w:t>
-      </w:r>
-      <w:proofErr w:type="gramEnd"/>
-      <w:r>
-        <w:rPr>
-          <w:sz w:val="24"/>
-          <w:szCs w:val="24"/>
-        </w:rPr>
-        <w:t xml:space="preserve"> I make new progress and gain skill. However, I don’t think the enemies should be to predictable or easy to learn as it sometimes feels that fights which should take time may end very quickly.</w:t>
+        <w:t>A – I think the enemies should feel like a challenge to face in combat but should not be so difficult as to overwhelm the player. I enjoy having to learn the attacks of each enemy as it feels like each run I make new progress and gain skill. However, I don’t think the enemies should be to predictable or easy to learn as it sometimes feels that fights which should take time may end very quickly.</w:t>
       </w:r>
     </w:p>
     <w:p>
@@ -656,23 +1186,7 @@
           <w:sz w:val="24"/>
           <w:szCs w:val="24"/>
         </w:rPr>
-        <w:t xml:space="preserve">A – I enjoy when the movement and combat is fast paced but sometimes find as a player that too much speed can become chaotic. You will need to find a balance to make the game engaging but not overwhelming. I often find that games with slow movement speed can make me very bored. Same for combat, if I’m waiting ages for an </w:t>
-      </w:r>
-      <w:proofErr w:type="gramStart"/>
-      <w:r>
-        <w:rPr>
-          <w:sz w:val="24"/>
-          <w:szCs w:val="24"/>
-        </w:rPr>
-        <w:t>opening</w:t>
-      </w:r>
-      <w:proofErr w:type="gramEnd"/>
-      <w:r>
-        <w:rPr>
-          <w:sz w:val="24"/>
-          <w:szCs w:val="24"/>
-        </w:rPr>
-        <w:t xml:space="preserve"> I get tired of the fight. I do enjoy when games give you the choice of pace. Different abilities that change the players speed and attacks makes it interesting and gives the player a choice of how they would like to play.</w:t>
+        <w:t>A – I enjoy when the movement and combat is fast paced but sometimes find as a player that too much speed can become chaotic. You will need to find a balance to make the game engaging but not overwhelming. I often find that games with slow movement speed can make me very bored. Same for combat, if I’m waiting ages for an opening I get tired of the fight. I do enjoy when games give you the choice of pace. Different abilities that change the players speed and attacks makes it interesting and gives the player a choice of how they would like to play.</w:t>
       </w:r>
     </w:p>
     <w:p>
@@ -764,23 +1278,14 @@
           <w:sz w:val="24"/>
           <w:szCs w:val="24"/>
         </w:rPr>
-        <w:t xml:space="preserve">A – I would like there to be many weapons that can be used in the game. I think it is fun to try combat with different styles of weapon. By varying the types of </w:t>
-      </w:r>
-      <w:proofErr w:type="gramStart"/>
-      <w:r>
-        <w:rPr>
-          <w:sz w:val="24"/>
-          <w:szCs w:val="24"/>
-        </w:rPr>
-        <w:t>weapons</w:t>
-      </w:r>
-      <w:proofErr w:type="gramEnd"/>
-      <w:r>
-        <w:rPr>
-          <w:sz w:val="24"/>
-          <w:szCs w:val="24"/>
-        </w:rPr>
-        <w:t xml:space="preserve"> I think it makes it more interesting to the player and allows each run to be different.</w:t>
+        <w:t xml:space="preserve">A – I would like there to be many weapons that can be used in the game. </w:t>
+      </w:r>
+      <w:r>
+        <w:rPr>
+          <w:sz w:val="24"/>
+          <w:szCs w:val="24"/>
+        </w:rPr>
+        <w:t>‘The Binding Of Isaac’ does this really well by having each playable character have different ways of attacking. Each different way also comes with different stats so each weapon leans into a different style of play.</w:t>
       </w:r>
     </w:p>
     <w:p>
@@ -809,10 +1314,11 @@
           <w:szCs w:val="40"/>
         </w:rPr>
       </w:pPr>
-      <w:bookmarkStart w:id="9" w:name="__RefHeading___Toc1039_50594169"/>
-      <w:bookmarkStart w:id="10" w:name="_Toc229035139"/>
-      <w:bookmarkStart w:id="11" w:name="_Toc222817104"/>
-      <w:bookmarkEnd w:id="9"/>
+      <w:bookmarkStart w:id="12" w:name="__RefHeading___Toc1039_50594169"/>
+      <w:bookmarkStart w:id="13" w:name="_Toc229035139"/>
+      <w:bookmarkStart w:id="14" w:name="_Toc222817104"/>
+      <w:bookmarkStart w:id="15" w:name="_Toc239941472"/>
+      <w:bookmarkEnd w:id="12"/>
       <w:r>
         <w:rPr>
           <w:sz w:val="40"/>
@@ -820,8 +1326,9 @@
         </w:rPr>
         <w:t>Reflections of Client Interview</w:t>
       </w:r>
-      <w:bookmarkEnd w:id="10"/>
-      <w:bookmarkEnd w:id="11"/>
+      <w:bookmarkEnd w:id="13"/>
+      <w:bookmarkEnd w:id="14"/>
+      <w:bookmarkEnd w:id="15"/>
     </w:p>
     <w:p>
       <w:pPr>
@@ -854,39 +1361,7 @@
           <w:sz w:val="24"/>
           <w:szCs w:val="24"/>
         </w:rPr>
-        <w:t xml:space="preserve">From the client interview I now feel I have a better understanding of the game I am to create. I know where I am to draw inspiration from which gives me the ability to create a </w:t>
-      </w:r>
-      <w:proofErr w:type="spellStart"/>
-      <w:r>
-        <w:rPr>
-          <w:sz w:val="24"/>
-          <w:szCs w:val="24"/>
-        </w:rPr>
-        <w:t>for</w:t>
-      </w:r>
-      <w:proofErr w:type="spellEnd"/>
-      <w:r>
-        <w:rPr>
-          <w:sz w:val="24"/>
-          <w:szCs w:val="24"/>
-        </w:rPr>
-        <w:t xml:space="preserve"> of plan as to the direction I will take the game. The client has requested a good balance between speed and control of the player and wants the combat to feel difficult but manageable. To achieve </w:t>
-      </w:r>
-      <w:proofErr w:type="gramStart"/>
-      <w:r>
-        <w:rPr>
-          <w:sz w:val="24"/>
-          <w:szCs w:val="24"/>
-        </w:rPr>
-        <w:t>this</w:t>
-      </w:r>
-      <w:proofErr w:type="gramEnd"/>
-      <w:r>
-        <w:rPr>
-          <w:sz w:val="24"/>
-          <w:szCs w:val="24"/>
-        </w:rPr>
-        <w:t xml:space="preserve"> I understand I will </w:t>
+        <w:t xml:space="preserve">From the client interview I now feel I have a better understanding of the game I am to create. I know where I am to draw inspiration from which gives me the ability to create a for of plan as to the direction I will take the game. The client has requested a good balance between speed and control of the player and wants the combat to feel difficult but manageable. To achieve this I understand I will have to put my game through many stages of testing both on my own and with the client to ensure the feel of the game is right for them. The interview has also given some insight into how the game should </w:t>
       </w:r>
       <w:r>
         <w:rPr>
@@ -894,14 +1369,23 @@
           <w:szCs w:val="24"/>
         </w:rPr>
         <w:lastRenderedPageBreak/>
-        <w:t>have to put my game through many stages of testing both on my own and with the client to ensure the feel of the game is right for them. The interview has also given some insight into how the game should look as the client gave details regarding the HUD (Head-Up Display) which will allow</w:t>
-      </w:r>
-      <w:r>
-        <w:rPr>
-          <w:sz w:val="24"/>
-          <w:szCs w:val="24"/>
-        </w:rPr>
-        <w:t xml:space="preserve"> me to create an immersive but not overwhelming experience to the end user.</w:t>
+        <w:t>look as the client gave details regarding the HUD (Head-Up Display) which will allow me to create an immersive but not overwhelming experience to the end user.</w:t>
+      </w:r>
+    </w:p>
+    <w:p>
+      <w:pPr>
+        <w:jc w:val="center"/>
+        <w:rPr>
+          <w:sz w:val="24"/>
+          <w:szCs w:val="24"/>
+        </w:rPr>
+      </w:pPr>
+      <w:r>
+        <w:rPr>
+          <w:sz w:val="24"/>
+          <w:szCs w:val="24"/>
+        </w:rPr>
+        <w:t>I must also consider ways to introduce fun items and different weapons/characters which Leo seemed to think made the game more engaging for the player.</w:t>
       </w:r>
     </w:p>
     <w:p>
@@ -930,10 +1414,11 @@
           <w:szCs w:val="40"/>
         </w:rPr>
       </w:pPr>
-      <w:bookmarkStart w:id="12" w:name="__RefHeading___Toc1041_50594169"/>
-      <w:bookmarkStart w:id="13" w:name="_Toc229035140"/>
-      <w:bookmarkStart w:id="14" w:name="_Toc222817105"/>
-      <w:bookmarkEnd w:id="12"/>
+      <w:bookmarkStart w:id="16" w:name="__RefHeading___Toc1041_50594169"/>
+      <w:bookmarkStart w:id="17" w:name="_Toc229035140"/>
+      <w:bookmarkStart w:id="18" w:name="_Toc222817105"/>
+      <w:bookmarkStart w:id="19" w:name="_Toc239941473"/>
+      <w:bookmarkEnd w:id="16"/>
       <w:r>
         <w:rPr>
           <w:sz w:val="40"/>
@@ -941,8 +1426,9 @@
         </w:rPr>
         <w:t>Objectives</w:t>
       </w:r>
-      <w:bookmarkEnd w:id="13"/>
-      <w:bookmarkEnd w:id="14"/>
+      <w:bookmarkEnd w:id="17"/>
+      <w:bookmarkEnd w:id="18"/>
+      <w:bookmarkEnd w:id="19"/>
     </w:p>
     <w:p>
       <w:pPr>
@@ -1109,23 +1595,27 @@
           <w:sz w:val="24"/>
           <w:szCs w:val="24"/>
         </w:rPr>
-        <w:t xml:space="preserve">Upon starting the </w:t>
-      </w:r>
-      <w:proofErr w:type="gramStart"/>
-      <w:r>
-        <w:rPr>
-          <w:sz w:val="24"/>
-          <w:szCs w:val="24"/>
-        </w:rPr>
-        <w:t>game</w:t>
-      </w:r>
-      <w:proofErr w:type="gramEnd"/>
-      <w:r>
-        <w:rPr>
-          <w:sz w:val="24"/>
-          <w:szCs w:val="24"/>
-        </w:rPr>
-        <w:t xml:space="preserve"> the player will select a character from a menu</w:t>
+        <w:t>Upon starting the game the player will select a character from a menu</w:t>
+      </w:r>
+    </w:p>
+    <w:p>
+      <w:pPr>
+        <w:pStyle w:val="ListParagraph"/>
+        <w:numPr>
+          <w:ilvl w:val="3"/>
+          <w:numId w:val="1"/>
+        </w:numPr>
+        <w:rPr>
+          <w:sz w:val="24"/>
+          <w:szCs w:val="24"/>
+        </w:rPr>
+      </w:pPr>
+      <w:r>
+        <w:rPr>
+          <w:sz w:val="24"/>
+          <w:szCs w:val="24"/>
+        </w:rPr>
+        <w:t>Each character will provide a slightly different experience of play</w:t>
       </w:r>
     </w:p>
     <w:p>
@@ -1225,14 +1715,7 @@
           <w:sz w:val="24"/>
           <w:szCs w:val="24"/>
         </w:rPr>
-        <w:t xml:space="preserve">There will be a camera which </w:t>
-      </w:r>
-      <w:r>
-        <w:rPr>
-          <w:sz w:val="24"/>
-          <w:szCs w:val="24"/>
-        </w:rPr>
-        <w:t>follows the player</w:t>
+        <w:t>There will be a camera which follows the player</w:t>
       </w:r>
     </w:p>
     <w:p>
@@ -1259,7 +1742,7 @@
       <w:pPr>
         <w:pStyle w:val="ListParagraph"/>
         <w:numPr>
-          <w:ilvl w:val="2"/>
+          <w:ilvl w:val="1"/>
           <w:numId w:val="1"/>
         </w:numPr>
         <w:rPr>
@@ -1272,7 +1755,7 @@
           <w:sz w:val="24"/>
           <w:szCs w:val="24"/>
         </w:rPr>
-        <w:t>The camera will use a matrix system which will allow for certain effects to be applied to the view</w:t>
+        <w:t>The character will be able to detect collisions and not walk through objects</w:t>
       </w:r>
     </w:p>
     <w:p>
@@ -1292,7 +1775,27 @@
           <w:sz w:val="24"/>
           <w:szCs w:val="24"/>
         </w:rPr>
-        <w:t>The character will be able to detect collisions and not walk through objects</w:t>
+        <w:t>The character will be able to tell when it has taken damage and reduce this from its health</w:t>
+      </w:r>
+    </w:p>
+    <w:p>
+      <w:pPr>
+        <w:pStyle w:val="ListParagraph"/>
+        <w:numPr>
+          <w:ilvl w:val="2"/>
+          <w:numId w:val="1"/>
+        </w:numPr>
+        <w:rPr>
+          <w:sz w:val="24"/>
+          <w:szCs w:val="24"/>
+        </w:rPr>
+      </w:pPr>
+      <w:r>
+        <w:rPr>
+          <w:sz w:val="24"/>
+          <w:szCs w:val="24"/>
+        </w:rPr>
+        <w:t>Each character will have a set amount of health at the start which may be both increased and decreased from</w:t>
       </w:r>
     </w:p>
     <w:p>
@@ -1312,7 +1815,27 @@
           <w:sz w:val="24"/>
           <w:szCs w:val="24"/>
         </w:rPr>
-        <w:t>The character will be able to tell when it has taken damage and reduce this from its health</w:t>
+        <w:t xml:space="preserve">The player will have stats which affect different qualities </w:t>
+      </w:r>
+    </w:p>
+    <w:p>
+      <w:pPr>
+        <w:pStyle w:val="ListParagraph"/>
+        <w:numPr>
+          <w:ilvl w:val="2"/>
+          <w:numId w:val="1"/>
+        </w:numPr>
+        <w:rPr>
+          <w:sz w:val="24"/>
+          <w:szCs w:val="24"/>
+        </w:rPr>
+      </w:pPr>
+      <w:r>
+        <w:rPr>
+          <w:sz w:val="24"/>
+          <w:szCs w:val="24"/>
+        </w:rPr>
+        <w:t>These stats may be changed by different items the player collects</w:t>
       </w:r>
     </w:p>
     <w:p>
@@ -1332,7 +1855,47 @@
           <w:sz w:val="24"/>
           <w:szCs w:val="24"/>
         </w:rPr>
-        <w:t>The player will be able to attack using weapons acquired in the game</w:t>
+        <w:t>The player will be animated</w:t>
+      </w:r>
+    </w:p>
+    <w:p>
+      <w:pPr>
+        <w:pStyle w:val="ListParagraph"/>
+        <w:numPr>
+          <w:ilvl w:val="2"/>
+          <w:numId w:val="1"/>
+        </w:numPr>
+        <w:rPr>
+          <w:sz w:val="24"/>
+          <w:szCs w:val="24"/>
+        </w:rPr>
+      </w:pPr>
+      <w:r>
+        <w:rPr>
+          <w:sz w:val="24"/>
+          <w:szCs w:val="24"/>
+        </w:rPr>
+        <w:t>The animations will be based on the direction the player is moving</w:t>
+      </w:r>
+    </w:p>
+    <w:p>
+      <w:pPr>
+        <w:pStyle w:val="ListParagraph"/>
+        <w:numPr>
+          <w:ilvl w:val="0"/>
+          <w:numId w:val="1"/>
+        </w:numPr>
+        <w:rPr>
+          <w:sz w:val="24"/>
+          <w:szCs w:val="24"/>
+        </w:rPr>
+      </w:pPr>
+      <w:r>
+        <w:rPr>
+          <w:sz w:val="24"/>
+          <w:szCs w:val="24"/>
+        </w:rPr>
+        <w:t>Provide a map for the player</w:t>
       </w:r>
     </w:p>
     <w:p>
@@ -1352,7 +1915,7 @@
           <w:sz w:val="24"/>
           <w:szCs w:val="24"/>
         </w:rPr>
-        <w:t xml:space="preserve">The player will have stats which affect different qualities </w:t>
+        <w:t>The map will consist of a series of nodes in a grid</w:t>
       </w:r>
     </w:p>
     <w:p>
@@ -1372,7 +1935,47 @@
           <w:sz w:val="24"/>
           <w:szCs w:val="24"/>
         </w:rPr>
-        <w:t>The player will be animated</w:t>
+        <w:t>The player will be able to navigate through the map</w:t>
+      </w:r>
+    </w:p>
+    <w:p>
+      <w:pPr>
+        <w:pStyle w:val="ListParagraph"/>
+        <w:numPr>
+          <w:ilvl w:val="1"/>
+          <w:numId w:val="1"/>
+        </w:numPr>
+        <w:rPr>
+          <w:sz w:val="24"/>
+          <w:szCs w:val="24"/>
+        </w:rPr>
+      </w:pPr>
+      <w:r>
+        <w:rPr>
+          <w:sz w:val="24"/>
+          <w:szCs w:val="24"/>
+        </w:rPr>
+        <w:t>The map will have solid objects which the character cannot pass through</w:t>
+      </w:r>
+    </w:p>
+    <w:p>
+      <w:pPr>
+        <w:pStyle w:val="ListParagraph"/>
+        <w:numPr>
+          <w:ilvl w:val="1"/>
+          <w:numId w:val="1"/>
+        </w:numPr>
+        <w:rPr>
+          <w:sz w:val="24"/>
+          <w:szCs w:val="24"/>
+        </w:rPr>
+      </w:pPr>
+      <w:r>
+        <w:rPr>
+          <w:sz w:val="24"/>
+          <w:szCs w:val="24"/>
+        </w:rPr>
+        <w:t>The map will be generated randomly each time the player starts a new run</w:t>
       </w:r>
     </w:p>
     <w:p>
@@ -1392,7 +1995,7 @@
           <w:sz w:val="24"/>
           <w:szCs w:val="24"/>
         </w:rPr>
-        <w:t>The animations will be based on the direction the player is moving</w:t>
+        <w:t>Rooms with corridors will be randomly generated and rooms will be assigned features based on location</w:t>
       </w:r>
     </w:p>
     <w:p>
@@ -1412,7 +2015,7 @@
           <w:sz w:val="24"/>
           <w:szCs w:val="24"/>
         </w:rPr>
-        <w:t>Provide a map for the player</w:t>
+        <w:t>Create enemies which will follow and attack the player</w:t>
       </w:r>
     </w:p>
     <w:p>
@@ -1432,7 +2035,7 @@
           <w:sz w:val="24"/>
           <w:szCs w:val="24"/>
         </w:rPr>
-        <w:t>The map will consist of a series of nodes in a grid</w:t>
+        <w:t>Enemies will use the A* algorithm to follow the player around the map</w:t>
       </w:r>
     </w:p>
     <w:p>
@@ -1452,7 +2055,8 @@
           <w:sz w:val="24"/>
           <w:szCs w:val="24"/>
         </w:rPr>
-        <w:t>The player will be able to navigate through the map</w:t>
+        <w:lastRenderedPageBreak/>
+        <w:t>They will follow a finite-state system allowing them to make decisions based on the situation</w:t>
       </w:r>
     </w:p>
     <w:p>
@@ -1472,7 +2076,7 @@
           <w:sz w:val="24"/>
           <w:szCs w:val="24"/>
         </w:rPr>
-        <w:t>The map will contain many textures</w:t>
+        <w:t>They will have attacks which can damage the player</w:t>
       </w:r>
     </w:p>
     <w:p>
@@ -1492,7 +2096,27 @@
           <w:sz w:val="24"/>
           <w:szCs w:val="24"/>
         </w:rPr>
-        <w:t>These will be mapped to the grid using a tile map</w:t>
+        <w:t>Their attacks will have hit boxes which can be detected by the player</w:t>
+      </w:r>
+    </w:p>
+    <w:p>
+      <w:pPr>
+        <w:pStyle w:val="ListParagraph"/>
+        <w:numPr>
+          <w:ilvl w:val="2"/>
+          <w:numId w:val="1"/>
+        </w:numPr>
+        <w:rPr>
+          <w:sz w:val="24"/>
+          <w:szCs w:val="24"/>
+        </w:rPr>
+      </w:pPr>
+      <w:r>
+        <w:rPr>
+          <w:sz w:val="24"/>
+          <w:szCs w:val="24"/>
+        </w:rPr>
+        <w:t>Different attacks and different enemies will be able to do different damages</w:t>
       </w:r>
     </w:p>
     <w:p>
@@ -1512,7 +2136,27 @@
           <w:sz w:val="24"/>
           <w:szCs w:val="24"/>
         </w:rPr>
-        <w:t>The map will have solid objects which the character cannot pass through</w:t>
+        <w:t>There will be different enemies with different attack patterns</w:t>
+      </w:r>
+    </w:p>
+    <w:p>
+      <w:pPr>
+        <w:pStyle w:val="ListParagraph"/>
+        <w:numPr>
+          <w:ilvl w:val="2"/>
+          <w:numId w:val="1"/>
+        </w:numPr>
+        <w:rPr>
+          <w:sz w:val="24"/>
+          <w:szCs w:val="24"/>
+        </w:rPr>
+      </w:pPr>
+      <w:r>
+        <w:rPr>
+          <w:sz w:val="24"/>
+          <w:szCs w:val="24"/>
+        </w:rPr>
+        <w:t>There will be boss type enemies which will be difficult and deal more damage</w:t>
       </w:r>
     </w:p>
     <w:p>
@@ -1532,7 +2176,107 @@
           <w:sz w:val="24"/>
           <w:szCs w:val="24"/>
         </w:rPr>
-        <w:t>The map will be generated randomly each time the player starts a new run</w:t>
+        <w:t>New enemies will spawn in designated locations</w:t>
+      </w:r>
+    </w:p>
+    <w:p>
+      <w:pPr>
+        <w:pStyle w:val="ListParagraph"/>
+        <w:numPr>
+          <w:ilvl w:val="1"/>
+          <w:numId w:val="1"/>
+        </w:numPr>
+        <w:rPr>
+          <w:sz w:val="24"/>
+          <w:szCs w:val="24"/>
+        </w:rPr>
+      </w:pPr>
+      <w:r>
+        <w:rPr>
+          <w:sz w:val="24"/>
+          <w:szCs w:val="24"/>
+        </w:rPr>
+        <w:t>Enemies will have health which can be reduced by the players attacks</w:t>
+      </w:r>
+    </w:p>
+    <w:p>
+      <w:pPr>
+        <w:pStyle w:val="ListParagraph"/>
+        <w:numPr>
+          <w:ilvl w:val="2"/>
+          <w:numId w:val="1"/>
+        </w:numPr>
+        <w:rPr>
+          <w:sz w:val="24"/>
+          <w:szCs w:val="24"/>
+        </w:rPr>
+      </w:pPr>
+      <w:r>
+        <w:rPr>
+          <w:sz w:val="24"/>
+          <w:szCs w:val="24"/>
+        </w:rPr>
+        <w:t>When an enemy’s health is 0, the enemy will die and be removed from the screen</w:t>
+      </w:r>
+    </w:p>
+    <w:p>
+      <w:pPr>
+        <w:pStyle w:val="ListParagraph"/>
+        <w:numPr>
+          <w:ilvl w:val="2"/>
+          <w:numId w:val="1"/>
+        </w:numPr>
+        <w:rPr>
+          <w:sz w:val="24"/>
+          <w:szCs w:val="24"/>
+        </w:rPr>
+      </w:pPr>
+      <w:r>
+        <w:rPr>
+          <w:sz w:val="24"/>
+          <w:szCs w:val="24"/>
+        </w:rPr>
+        <w:t>Some enemies will have more or less health depending on how difficult they are intended to be to kill</w:t>
+      </w:r>
+    </w:p>
+    <w:p>
+      <w:pPr>
+        <w:pStyle w:val="ListParagraph"/>
+        <w:numPr>
+          <w:ilvl w:val="2"/>
+          <w:numId w:val="1"/>
+        </w:numPr>
+        <w:rPr>
+          <w:sz w:val="24"/>
+          <w:szCs w:val="24"/>
+        </w:rPr>
+      </w:pPr>
+      <w:r>
+        <w:rPr>
+          <w:sz w:val="24"/>
+          <w:szCs w:val="24"/>
+        </w:rPr>
+        <w:t>Boss enemies will have large amounts of health</w:t>
+      </w:r>
+    </w:p>
+    <w:p>
+      <w:pPr>
+        <w:pStyle w:val="ListParagraph"/>
+        <w:numPr>
+          <w:ilvl w:val="1"/>
+          <w:numId w:val="1"/>
+        </w:numPr>
+        <w:rPr>
+          <w:sz w:val="24"/>
+          <w:szCs w:val="24"/>
+        </w:rPr>
+      </w:pPr>
+      <w:r>
+        <w:rPr>
+          <w:sz w:val="24"/>
+          <w:szCs w:val="24"/>
+        </w:rPr>
+        <w:t>Enemies will have animations that depend on their direction of movement</w:t>
       </w:r>
     </w:p>
     <w:p>
@@ -1552,7 +2296,7 @@
           <w:sz w:val="24"/>
           <w:szCs w:val="24"/>
         </w:rPr>
-        <w:t>Create enemies which will follow and attack the player</w:t>
+        <w:t>Provide a menu within the game which will pause the game behind it</w:t>
       </w:r>
     </w:p>
     <w:p>
@@ -1572,14 +2316,7 @@
           <w:sz w:val="24"/>
           <w:szCs w:val="24"/>
         </w:rPr>
-        <w:t xml:space="preserve">Enemies will use the A* </w:t>
-      </w:r>
-      <w:r>
-        <w:rPr>
-          <w:sz w:val="24"/>
-          <w:szCs w:val="24"/>
-        </w:rPr>
-        <w:t>algorithm to follow the player around the map</w:t>
+        <w:t>The menu will allow the player to view their stats</w:t>
       </w:r>
     </w:p>
     <w:p>
@@ -1599,7 +2336,7 @@
           <w:sz w:val="24"/>
           <w:szCs w:val="24"/>
         </w:rPr>
-        <w:t>They will follow a finite-state system allowing them to make decisions based on the situation</w:t>
+        <w:t>The player will be able to equip new items</w:t>
       </w:r>
     </w:p>
     <w:p>
@@ -1619,8 +2356,27 @@
           <w:sz w:val="24"/>
           <w:szCs w:val="24"/>
         </w:rPr>
-        <w:lastRenderedPageBreak/>
-        <w:t>They will have attacks which can damage the player</w:t>
+        <w:t>The player will be able to change their settings</w:t>
+      </w:r>
+    </w:p>
+    <w:p>
+      <w:pPr>
+        <w:pStyle w:val="ListParagraph"/>
+        <w:numPr>
+          <w:ilvl w:val="1"/>
+          <w:numId w:val="1"/>
+        </w:numPr>
+        <w:rPr>
+          <w:sz w:val="24"/>
+          <w:szCs w:val="24"/>
+        </w:rPr>
+      </w:pPr>
+      <w:r>
+        <w:rPr>
+          <w:sz w:val="24"/>
+          <w:szCs w:val="24"/>
+        </w:rPr>
+        <w:t>The player will be able to save the game and exit</w:t>
       </w:r>
     </w:p>
     <w:p>
@@ -1640,7 +2396,7 @@
           <w:sz w:val="24"/>
           <w:szCs w:val="24"/>
         </w:rPr>
-        <w:t>Their attacks will have hit boxes which can be detected by the player</w:t>
+        <w:t>The current game state will be saved to a file</w:t>
       </w:r>
     </w:p>
     <w:p>
@@ -1660,313 +2416,6 @@
           <w:sz w:val="24"/>
           <w:szCs w:val="24"/>
         </w:rPr>
-        <w:t>Different attacks and different enemies will be able to do different damages</w:t>
-      </w:r>
-    </w:p>
-    <w:p>
-      <w:pPr>
-        <w:pStyle w:val="ListParagraph"/>
-        <w:numPr>
-          <w:ilvl w:val="1"/>
-          <w:numId w:val="1"/>
-        </w:numPr>
-        <w:rPr>
-          <w:sz w:val="24"/>
-          <w:szCs w:val="24"/>
-        </w:rPr>
-      </w:pPr>
-      <w:r>
-        <w:rPr>
-          <w:sz w:val="24"/>
-          <w:szCs w:val="24"/>
-        </w:rPr>
-        <w:t>There will be different enemies with different attack patterns</w:t>
-      </w:r>
-    </w:p>
-    <w:p>
-      <w:pPr>
-        <w:pStyle w:val="ListParagraph"/>
-        <w:numPr>
-          <w:ilvl w:val="2"/>
-          <w:numId w:val="1"/>
-        </w:numPr>
-        <w:rPr>
-          <w:sz w:val="24"/>
-          <w:szCs w:val="24"/>
-        </w:rPr>
-      </w:pPr>
-      <w:r>
-        <w:rPr>
-          <w:sz w:val="24"/>
-          <w:szCs w:val="24"/>
-        </w:rPr>
-        <w:t>There will be boss type enemies which will be difficult and deal more damage</w:t>
-      </w:r>
-    </w:p>
-    <w:p>
-      <w:pPr>
-        <w:pStyle w:val="ListParagraph"/>
-        <w:numPr>
-          <w:ilvl w:val="1"/>
-          <w:numId w:val="1"/>
-        </w:numPr>
-        <w:rPr>
-          <w:sz w:val="24"/>
-          <w:szCs w:val="24"/>
-        </w:rPr>
-      </w:pPr>
-      <w:r>
-        <w:rPr>
-          <w:sz w:val="24"/>
-          <w:szCs w:val="24"/>
-        </w:rPr>
-        <w:t>New enemies will spawn in designated locations</w:t>
-      </w:r>
-    </w:p>
-    <w:p>
-      <w:pPr>
-        <w:pStyle w:val="ListParagraph"/>
-        <w:numPr>
-          <w:ilvl w:val="1"/>
-          <w:numId w:val="1"/>
-        </w:numPr>
-        <w:rPr>
-          <w:sz w:val="24"/>
-          <w:szCs w:val="24"/>
-        </w:rPr>
-      </w:pPr>
-      <w:r>
-        <w:rPr>
-          <w:sz w:val="24"/>
-          <w:szCs w:val="24"/>
-        </w:rPr>
-        <w:t>Enemies will have health which can be reduced by the players attacks</w:t>
-      </w:r>
-    </w:p>
-    <w:p>
-      <w:pPr>
-        <w:pStyle w:val="ListParagraph"/>
-        <w:numPr>
-          <w:ilvl w:val="2"/>
-          <w:numId w:val="1"/>
-        </w:numPr>
-        <w:rPr>
-          <w:sz w:val="24"/>
-          <w:szCs w:val="24"/>
-        </w:rPr>
-      </w:pPr>
-      <w:r>
-        <w:rPr>
-          <w:sz w:val="24"/>
-          <w:szCs w:val="24"/>
-        </w:rPr>
-        <w:t>When an enemy’s health is 0, the enemy will die and be removed from the screen</w:t>
-      </w:r>
-    </w:p>
-    <w:p>
-      <w:pPr>
-        <w:pStyle w:val="ListParagraph"/>
-        <w:numPr>
-          <w:ilvl w:val="2"/>
-          <w:numId w:val="1"/>
-        </w:numPr>
-        <w:rPr>
-          <w:sz w:val="24"/>
-          <w:szCs w:val="24"/>
-        </w:rPr>
-      </w:pPr>
-      <w:r>
-        <w:rPr>
-          <w:sz w:val="24"/>
-          <w:szCs w:val="24"/>
-        </w:rPr>
-        <w:t xml:space="preserve">Some enemies will have more or less health depending on how difficult they are intended to be </w:t>
-      </w:r>
-      <w:r>
-        <w:rPr>
-          <w:sz w:val="24"/>
-          <w:szCs w:val="24"/>
-        </w:rPr>
-        <w:t>to kill</w:t>
-      </w:r>
-    </w:p>
-    <w:p>
-      <w:pPr>
-        <w:pStyle w:val="ListParagraph"/>
-        <w:numPr>
-          <w:ilvl w:val="2"/>
-          <w:numId w:val="1"/>
-        </w:numPr>
-        <w:rPr>
-          <w:sz w:val="24"/>
-          <w:szCs w:val="24"/>
-        </w:rPr>
-      </w:pPr>
-      <w:r>
-        <w:rPr>
-          <w:sz w:val="24"/>
-          <w:szCs w:val="24"/>
-        </w:rPr>
-        <w:t>Boss enemies will have large amounts of health</w:t>
-      </w:r>
-    </w:p>
-    <w:p>
-      <w:pPr>
-        <w:pStyle w:val="ListParagraph"/>
-        <w:numPr>
-          <w:ilvl w:val="1"/>
-          <w:numId w:val="1"/>
-        </w:numPr>
-        <w:rPr>
-          <w:sz w:val="24"/>
-          <w:szCs w:val="24"/>
-        </w:rPr>
-      </w:pPr>
-      <w:r>
-        <w:rPr>
-          <w:sz w:val="24"/>
-          <w:szCs w:val="24"/>
-        </w:rPr>
-        <w:t>Enemies will have animations that depend on their direction of movement</w:t>
-      </w:r>
-    </w:p>
-    <w:p>
-      <w:pPr>
-        <w:pStyle w:val="ListParagraph"/>
-        <w:numPr>
-          <w:ilvl w:val="0"/>
-          <w:numId w:val="1"/>
-        </w:numPr>
-        <w:rPr>
-          <w:sz w:val="24"/>
-          <w:szCs w:val="24"/>
-        </w:rPr>
-      </w:pPr>
-      <w:r>
-        <w:rPr>
-          <w:sz w:val="24"/>
-          <w:szCs w:val="24"/>
-        </w:rPr>
-        <w:t>Provide a menu within the game which will pause the game behind it</w:t>
-      </w:r>
-    </w:p>
-    <w:p>
-      <w:pPr>
-        <w:pStyle w:val="ListParagraph"/>
-        <w:numPr>
-          <w:ilvl w:val="1"/>
-          <w:numId w:val="1"/>
-        </w:numPr>
-        <w:rPr>
-          <w:sz w:val="24"/>
-          <w:szCs w:val="24"/>
-        </w:rPr>
-      </w:pPr>
-      <w:r>
-        <w:rPr>
-          <w:sz w:val="24"/>
-          <w:szCs w:val="24"/>
-        </w:rPr>
-        <w:t>The menu will allow the player to view their stats</w:t>
-      </w:r>
-    </w:p>
-    <w:p>
-      <w:pPr>
-        <w:pStyle w:val="ListParagraph"/>
-        <w:numPr>
-          <w:ilvl w:val="1"/>
-          <w:numId w:val="1"/>
-        </w:numPr>
-        <w:rPr>
-          <w:sz w:val="24"/>
-          <w:szCs w:val="24"/>
-        </w:rPr>
-      </w:pPr>
-      <w:r>
-        <w:rPr>
-          <w:sz w:val="24"/>
-          <w:szCs w:val="24"/>
-        </w:rPr>
-        <w:t>The player will be able to equip new items</w:t>
-      </w:r>
-    </w:p>
-    <w:p>
-      <w:pPr>
-        <w:pStyle w:val="ListParagraph"/>
-        <w:numPr>
-          <w:ilvl w:val="1"/>
-          <w:numId w:val="1"/>
-        </w:numPr>
-        <w:rPr>
-          <w:sz w:val="24"/>
-          <w:szCs w:val="24"/>
-        </w:rPr>
-      </w:pPr>
-      <w:r>
-        <w:rPr>
-          <w:sz w:val="24"/>
-          <w:szCs w:val="24"/>
-        </w:rPr>
-        <w:t>The player will be able to change their settings</w:t>
-      </w:r>
-    </w:p>
-    <w:p>
-      <w:pPr>
-        <w:pStyle w:val="ListParagraph"/>
-        <w:numPr>
-          <w:ilvl w:val="1"/>
-          <w:numId w:val="1"/>
-        </w:numPr>
-        <w:rPr>
-          <w:sz w:val="24"/>
-          <w:szCs w:val="24"/>
-        </w:rPr>
-      </w:pPr>
-      <w:r>
-        <w:rPr>
-          <w:sz w:val="24"/>
-          <w:szCs w:val="24"/>
-        </w:rPr>
-        <w:t>The player will be able to save the game and exit</w:t>
-      </w:r>
-    </w:p>
-    <w:p>
-      <w:pPr>
-        <w:pStyle w:val="ListParagraph"/>
-        <w:numPr>
-          <w:ilvl w:val="2"/>
-          <w:numId w:val="1"/>
-        </w:numPr>
-        <w:rPr>
-          <w:sz w:val="24"/>
-          <w:szCs w:val="24"/>
-        </w:rPr>
-      </w:pPr>
-      <w:r>
-        <w:rPr>
-          <w:sz w:val="24"/>
-          <w:szCs w:val="24"/>
-        </w:rPr>
-        <w:t>The current game state will be saved to a file</w:t>
-      </w:r>
-    </w:p>
-    <w:p>
-      <w:pPr>
-        <w:pStyle w:val="ListParagraph"/>
-        <w:numPr>
-          <w:ilvl w:val="2"/>
-          <w:numId w:val="1"/>
-        </w:numPr>
-        <w:rPr>
-          <w:sz w:val="24"/>
-          <w:szCs w:val="24"/>
-        </w:rPr>
-      </w:pPr>
-      <w:r>
-        <w:rPr>
-          <w:sz w:val="24"/>
-          <w:szCs w:val="24"/>
-        </w:rPr>
         <w:t>The player will be able to open to this save again</w:t>
       </w:r>
     </w:p>
@@ -2260,14 +2709,7 @@
           <w:sz w:val="24"/>
           <w:szCs w:val="24"/>
         </w:rPr>
-        <w:t xml:space="preserve">The additional objectives will form a </w:t>
-      </w:r>
-      <w:r>
-        <w:rPr>
-          <w:sz w:val="24"/>
-          <w:szCs w:val="24"/>
-        </w:rPr>
-        <w:t>complete game. The user experience will be complete and the user should have a good time playing the game. The game after completion of the additional objectives will meet the full set of desires set by the client.</w:t>
+        <w:t>The additional objectives will form a complete game. The user experience will be complete and the user should have a good time playing the game. The game after completion of the additional objectives will meet the full set of desires set by the client.</w:t>
       </w:r>
     </w:p>
     <w:p>
@@ -2286,10 +2728,11 @@
           <w:szCs w:val="40"/>
         </w:rPr>
       </w:pPr>
-      <w:bookmarkStart w:id="15" w:name="__RefHeading___Toc1043_50594169"/>
-      <w:bookmarkStart w:id="16" w:name="_Toc229035141"/>
-      <w:bookmarkStart w:id="17" w:name="_Toc222817106"/>
-      <w:bookmarkEnd w:id="15"/>
+      <w:bookmarkStart w:id="20" w:name="__RefHeading___Toc1043_50594169"/>
+      <w:bookmarkStart w:id="21" w:name="_Toc229035141"/>
+      <w:bookmarkStart w:id="22" w:name="_Toc222817106"/>
+      <w:bookmarkStart w:id="23" w:name="_Toc239941474"/>
+      <w:bookmarkEnd w:id="20"/>
       <w:r>
         <w:rPr>
           <w:sz w:val="40"/>
@@ -2298,8 +2741,9 @@
         <w:lastRenderedPageBreak/>
         <w:t>Modelling</w:t>
       </w:r>
-      <w:bookmarkEnd w:id="16"/>
-      <w:bookmarkEnd w:id="17"/>
+      <w:bookmarkEnd w:id="21"/>
+      <w:bookmarkEnd w:id="22"/>
+      <w:bookmarkEnd w:id="23"/>
     </w:p>
     <w:p>
       <w:pPr>
@@ -2392,6 +2836,15 @@
         <w:br/>
         <w:t>Camera – The ‘camera’ describes the graphical elements of the game currently displayed within the bounds of the game window. By using matrix multiplication and translation the camera can be centred on the players location.</w:t>
       </w:r>
+    </w:p>
+    <w:p>
+      <w:pPr>
+        <w:jc w:val="center"/>
+        <w:rPr>
+          <w:sz w:val="24"/>
+          <w:szCs w:val="24"/>
+        </w:rPr>
+      </w:pPr>
     </w:p>
     <w:p>
       <w:pPr>
@@ -3305,23 +3758,7 @@
           <w:sz w:val="24"/>
           <w:szCs w:val="24"/>
         </w:rPr>
-        <w:t xml:space="preserve">First the algorithm considers the </w:t>
-      </w:r>
-      <w:proofErr w:type="gramStart"/>
-      <w:r>
-        <w:rPr>
-          <w:sz w:val="24"/>
-          <w:szCs w:val="24"/>
-        </w:rPr>
-        <w:t>enemies</w:t>
-      </w:r>
-      <w:proofErr w:type="gramEnd"/>
-      <w:r>
-        <w:rPr>
-          <w:sz w:val="24"/>
-          <w:szCs w:val="24"/>
-        </w:rPr>
-        <w:t xml:space="preserve"> position. It then assigns each neighbouring node a value base on the total the cost to reach the node and the potential cost from that node to the end. The potential cost is calculated using Pythagoras’ formula.</w:t>
+        <w:t>First the algorithm considers the enemies position. It then assigns each neighbouring node a value base on the total the cost to reach the node and the potential cost from that node to the end. The potential cost is calculated using Pythagoras’ formula.</w:t>
       </w:r>
     </w:p>
     <w:p>
@@ -3384,6 +3821,7 @@
                 <w:sz w:val="24"/>
                 <w:szCs w:val="24"/>
               </w:rPr>
+              <w:lastRenderedPageBreak/>
               <w:t>Enemy</w:t>
             </w:r>
           </w:p>
@@ -3544,7 +3982,6 @@
                 <w:sz w:val="24"/>
                 <w:szCs w:val="24"/>
               </w:rPr>
-              <w:lastRenderedPageBreak/>
               <w:t>1 + 6.4</w:t>
             </w:r>
           </w:p>
@@ -4241,14 +4678,7 @@
           <w:sz w:val="24"/>
           <w:szCs w:val="24"/>
         </w:rPr>
-        <w:t xml:space="preserve">It then considers the next node which has the lowest value and considers the cost to all of its neighbours. It also updates the cost of </w:t>
-      </w:r>
-      <w:r>
-        <w:rPr>
-          <w:sz w:val="24"/>
-          <w:szCs w:val="24"/>
-        </w:rPr>
-        <w:t>already checked nodes if the cost through the current node is cheaper.</w:t>
+        <w:t>It then considers the next node which has the lowest value and considers the cost to all of its neighbours. It also updates the cost of already checked nodes if the cost through the current node is cheaper.</w:t>
       </w:r>
     </w:p>
     <w:p>
@@ -5460,15 +5890,7 @@
                 <w:sz w:val="24"/>
                 <w:szCs w:val="24"/>
               </w:rPr>
-              <w:t xml:space="preserve">1 + </w:t>
-            </w:r>
-            <w:r>
-              <w:rPr>
-                <w:rFonts w:ascii="Liberation Serif" w:hAnsi="Liberation Serif"/>
-                <w:sz w:val="24"/>
-                <w:szCs w:val="24"/>
-              </w:rPr>
-              <w:t>5.7</w:t>
+              <w:t>1 + 5.7</w:t>
             </w:r>
           </w:p>
         </w:tc>
@@ -5849,15 +6271,7 @@
                 <w:sz w:val="24"/>
                 <w:szCs w:val="24"/>
               </w:rPr>
-              <w:t>3 + 2.</w:t>
-            </w:r>
-            <w:r>
-              <w:rPr>
-                <w:rFonts w:ascii="Liberation Serif" w:hAnsi="Liberation Serif"/>
-                <w:sz w:val="24"/>
-                <w:szCs w:val="24"/>
-              </w:rPr>
-              <w:t>8</w:t>
+              <w:t>3 + 2.8</w:t>
             </w:r>
           </w:p>
         </w:tc>
@@ -6816,15 +7230,7 @@
                 <w:sz w:val="24"/>
                 <w:szCs w:val="24"/>
               </w:rPr>
-              <w:t xml:space="preserve">3 + </w:t>
-            </w:r>
-            <w:r>
-              <w:rPr>
-                <w:rFonts w:ascii="Liberation Serif" w:hAnsi="Liberation Serif"/>
-                <w:sz w:val="24"/>
-                <w:szCs w:val="24"/>
-              </w:rPr>
-              <w:t>3.6</w:t>
+              <w:t>3 + 3.6</w:t>
             </w:r>
           </w:p>
         </w:tc>
@@ -6852,15 +7258,7 @@
                 <w:sz w:val="24"/>
                 <w:szCs w:val="24"/>
               </w:rPr>
-              <w:t>3 + 2.</w:t>
-            </w:r>
-            <w:r>
-              <w:rPr>
-                <w:rFonts w:ascii="Liberation Serif" w:hAnsi="Liberation Serif"/>
-                <w:sz w:val="24"/>
-                <w:szCs w:val="24"/>
-              </w:rPr>
-              <w:t>8</w:t>
+              <w:t>3 + 2.8</w:t>
             </w:r>
           </w:p>
         </w:tc>
@@ -7913,15 +8311,7 @@
                 <w:sz w:val="24"/>
                 <w:szCs w:val="24"/>
               </w:rPr>
-              <w:t>3 + 2.</w:t>
-            </w:r>
-            <w:r>
-              <w:rPr>
-                <w:rFonts w:ascii="Liberation Serif" w:hAnsi="Liberation Serif"/>
-                <w:sz w:val="24"/>
-                <w:szCs w:val="24"/>
-              </w:rPr>
-              <w:t>8</w:t>
+              <w:t>3 + 2.8</w:t>
             </w:r>
           </w:p>
         </w:tc>
@@ -8112,15 +8502,7 @@
                 <w:sz w:val="24"/>
                 <w:szCs w:val="24"/>
               </w:rPr>
-              <w:t xml:space="preserve">4 + </w:t>
-            </w:r>
-            <w:r>
-              <w:rPr>
-                <w:rFonts w:ascii="Liberation Serif" w:hAnsi="Liberation Serif"/>
-                <w:sz w:val="24"/>
-                <w:szCs w:val="24"/>
-              </w:rPr>
-              <w:t>1.4</w:t>
+              <w:t>4 + 1.4</w:t>
             </w:r>
           </w:p>
         </w:tc>
@@ -8335,14 +8717,7 @@
           <w:sz w:val="24"/>
           <w:szCs w:val="24"/>
         </w:rPr>
-        <w:t xml:space="preserve">By considering each node in this way the algorithm will eventually reach the node at which the player is on and have a complete list of nodes which form the optimal route. This algorithm is efficient as it </w:t>
-      </w:r>
-      <w:r>
-        <w:rPr>
-          <w:sz w:val="24"/>
-          <w:szCs w:val="24"/>
-        </w:rPr>
-        <w:t>considers the potential cost of a node which reduces the need to check each node and ensures the nodes being checked are in the direction of the target. However, by also considering the current cost to a node it prevents the algorithm finding a sub-optimal path by heading directly to the target into an obstruction.</w:t>
+        <w:t>By considering each node in this way the algorithm will eventually reach the node at which the player is on and have a complete list of nodes which form the optimal route. This algorithm is efficient as it considers the potential cost of a node which reduces the need to check each node and ensures the nodes being checked are in the direction of the target. However, by also considering the current cost to a node it prevents the algorithm finding a sub-optimal path by heading directly to the target into an obstruction.</w:t>
       </w:r>
     </w:p>
     <w:p>
@@ -8405,12 +8780,69 @@
           <w:szCs w:val="24"/>
         </w:rPr>
       </w:pPr>
-      <w:r>
-        <w:rPr>
-          <w:sz w:val="24"/>
-          <w:szCs w:val="24"/>
-        </w:rPr>
-        <w:lastRenderedPageBreak/>
+    </w:p>
+    <w:p>
+      <w:pPr>
+        <w:jc w:val="center"/>
+        <w:rPr>
+          <w:b/>
+          <w:bCs/>
+          <w:sz w:val="32"/>
+          <w:szCs w:val="32"/>
+        </w:rPr>
+      </w:pPr>
+      <w:r>
+        <w:rPr>
+          <w:b/>
+          <w:bCs/>
+          <w:sz w:val="32"/>
+          <w:szCs w:val="32"/>
+        </w:rPr>
+        <w:t>Finite State Machine</w:t>
+      </w:r>
+    </w:p>
+    <w:p>
+      <w:pPr>
+        <w:jc w:val="center"/>
+        <w:rPr>
+          <w:b/>
+          <w:bCs/>
+          <w:sz w:val="32"/>
+          <w:szCs w:val="32"/>
+        </w:rPr>
+      </w:pPr>
+    </w:p>
+    <w:p>
+      <w:pPr>
+        <w:jc w:val="center"/>
+        <w:rPr>
+          <w:sz w:val="24"/>
+          <w:szCs w:val="24"/>
+        </w:rPr>
+      </w:pPr>
+      <w:r>
+        <w:rPr>
+          <w:sz w:val="24"/>
+          <w:szCs w:val="24"/>
+        </w:rPr>
+        <w:t>Most enemies will use a system called a finite state machine to control their decisions. By using this system for enemies, I can ensure they react appropriately to events in the surroundings. As shown in the diagram below, each enemy will start in an IDLE state where it does not perform any actions. Enemies in this state will not perform any calculations e.g. A-Star as these can be heavy on the systems processing and memory. This will hopefully reduce any lag or latency which could occur otherwise. When these enemies are within a certain distance of the player, they will begin to take action. Based on the type of enemy, it will be able to make decisions based on position or distance from the player as to how it will act. This will hopefully create an enjoyable enemy experience for the player as enemies will be less predictable and more responsive to player actions.</w:t>
+      </w:r>
+    </w:p>
+    <w:p>
+      <w:pPr>
+        <w:jc w:val="center"/>
+        <w:rPr>
+          <w:noProof/>
+          <w:sz w:val="24"/>
+          <w:szCs w:val="24"/>
+        </w:rPr>
+      </w:pPr>
+      <w:r>
+        <w:rPr>
+          <w:noProof/>
+          <w:sz w:val="24"/>
+          <w:szCs w:val="24"/>
+        </w:rPr>
         <w:drawing>
           <wp:inline distT="0" distB="0" distL="0" distR="0" wp14:anchorId="385D079D" wp14:editId="6D5D3691">
             <wp:extent cx="6645910" cy="4813935"/>
@@ -8450,16 +8882,171 @@
     </w:p>
     <w:p>
       <w:pPr>
+        <w:tabs>
+          <w:tab w:val="left" w:pos="6285"/>
+        </w:tabs>
+        <w:jc w:val="center"/>
+        <w:rPr>
+          <w:sz w:val="24"/>
+          <w:szCs w:val="24"/>
+        </w:rPr>
+      </w:pPr>
+      <w:r>
+        <w:rPr>
+          <w:sz w:val="24"/>
+          <w:szCs w:val="24"/>
+        </w:rPr>
+        <w:t>This diagram shows a very simple design of how the enemies system may look. It also considers that if the enemies health drops to 0, it will always transition to the dead state which will remove it from the game.</w:t>
+      </w:r>
+    </w:p>
+    <w:p>
+      <w:pPr>
+        <w:tabs>
+          <w:tab w:val="left" w:pos="6285"/>
+        </w:tabs>
+        <w:jc w:val="center"/>
+        <w:rPr>
+          <w:sz w:val="24"/>
+          <w:szCs w:val="24"/>
+        </w:rPr>
+      </w:pPr>
+    </w:p>
+    <w:p>
+      <w:pPr>
+        <w:tabs>
+          <w:tab w:val="left" w:pos="6285"/>
+        </w:tabs>
+        <w:jc w:val="center"/>
+        <w:rPr>
+          <w:sz w:val="24"/>
+          <w:szCs w:val="24"/>
+        </w:rPr>
+      </w:pPr>
+    </w:p>
+    <w:p>
+      <w:pPr>
+        <w:tabs>
+          <w:tab w:val="left" w:pos="6285"/>
+        </w:tabs>
+        <w:jc w:val="center"/>
+        <w:rPr>
+          <w:sz w:val="24"/>
+          <w:szCs w:val="24"/>
+        </w:rPr>
+      </w:pPr>
+    </w:p>
+    <w:p>
+      <w:pPr>
+        <w:tabs>
+          <w:tab w:val="left" w:pos="6285"/>
+        </w:tabs>
+        <w:jc w:val="center"/>
+        <w:rPr>
+          <w:b/>
+          <w:bCs/>
+          <w:sz w:val="32"/>
+          <w:szCs w:val="32"/>
+        </w:rPr>
+      </w:pPr>
+      <w:r>
+        <w:rPr>
+          <w:b/>
+          <w:bCs/>
+          <w:sz w:val="32"/>
+          <w:szCs w:val="32"/>
+        </w:rPr>
+        <w:t>Room Generation</w:t>
+      </w:r>
+    </w:p>
+    <w:p>
+      <w:pPr>
+        <w:tabs>
+          <w:tab w:val="left" w:pos="6285"/>
+        </w:tabs>
+        <w:jc w:val="center"/>
+        <w:rPr>
+          <w:b/>
+          <w:bCs/>
+          <w:sz w:val="32"/>
+          <w:szCs w:val="32"/>
+        </w:rPr>
+      </w:pPr>
+    </w:p>
+    <w:p>
+      <w:pPr>
+        <w:tabs>
+          <w:tab w:val="left" w:pos="6285"/>
+        </w:tabs>
+        <w:jc w:val="center"/>
+        <w:rPr>
+          <w:sz w:val="24"/>
+          <w:szCs w:val="24"/>
+        </w:rPr>
+      </w:pPr>
+      <w:r>
+        <w:rPr>
+          <w:sz w:val="24"/>
+          <w:szCs w:val="24"/>
+        </w:rPr>
+        <w:t xml:space="preserve">The map and room generation for my game will incorporate different methods which, together, will create </w:t>
+      </w:r>
+      <w:r>
+        <w:rPr>
+          <w:sz w:val="24"/>
+          <w:szCs w:val="24"/>
+        </w:rPr>
+        <w:t>a map which is ideal for the player.</w:t>
+      </w:r>
+    </w:p>
+    <w:p>
+      <w:pPr>
+        <w:tabs>
+          <w:tab w:val="left" w:pos="6285"/>
+        </w:tabs>
+        <w:jc w:val="center"/>
+        <w:rPr>
+          <w:sz w:val="24"/>
+          <w:szCs w:val="24"/>
+        </w:rPr>
+      </w:pPr>
+    </w:p>
+    <w:p>
+      <w:pPr>
+        <w:tabs>
+          <w:tab w:val="left" w:pos="6285"/>
+        </w:tabs>
+        <w:jc w:val="center"/>
+        <w:rPr>
+          <w:sz w:val="24"/>
+          <w:szCs w:val="24"/>
+        </w:rPr>
+      </w:pPr>
+    </w:p>
+    <w:p>
+      <w:pPr>
+        <w:tabs>
+          <w:tab w:val="left" w:pos="6285"/>
+        </w:tabs>
+        <w:jc w:val="center"/>
+        <w:rPr>
+          <w:sz w:val="24"/>
+          <w:szCs w:val="24"/>
+        </w:rPr>
+      </w:pPr>
+    </w:p>
+    <w:p>
+      <w:pPr>
         <w:pStyle w:val="Heading1"/>
         <w:rPr>
           <w:sz w:val="50"/>
           <w:szCs w:val="50"/>
         </w:rPr>
       </w:pPr>
-      <w:bookmarkStart w:id="18" w:name="__RefHeading___Toc1045_50594169"/>
-      <w:bookmarkStart w:id="19" w:name="_Toc229035142"/>
-      <w:bookmarkStart w:id="20" w:name="_Toc222817107"/>
-      <w:bookmarkEnd w:id="18"/>
+      <w:bookmarkStart w:id="24" w:name="__RefHeading___Toc1045_50594169"/>
+      <w:bookmarkStart w:id="25" w:name="_Toc229035142"/>
+      <w:bookmarkStart w:id="26" w:name="_Toc222817107"/>
+      <w:bookmarkStart w:id="27" w:name="_Toc239941475"/>
+      <w:bookmarkEnd w:id="24"/>
       <w:r>
         <w:rPr>
           <w:sz w:val="50"/>
@@ -8467,8 +9054,9 @@
         </w:rPr>
         <w:t>Design</w:t>
       </w:r>
-      <w:bookmarkEnd w:id="19"/>
-      <w:bookmarkEnd w:id="20"/>
+      <w:bookmarkEnd w:id="25"/>
+      <w:bookmarkEnd w:id="26"/>
+      <w:bookmarkEnd w:id="27"/>
     </w:p>
     <w:p>
       <w:pPr>
@@ -8478,10 +9066,11 @@
           <w:szCs w:val="50"/>
         </w:rPr>
       </w:pPr>
-      <w:bookmarkStart w:id="21" w:name="__RefHeading___Toc1047_50594169"/>
-      <w:bookmarkStart w:id="22" w:name="_Toc229035143"/>
-      <w:bookmarkStart w:id="23" w:name="_Toc222817108"/>
-      <w:bookmarkEnd w:id="21"/>
+      <w:bookmarkStart w:id="28" w:name="__RefHeading___Toc1047_50594169"/>
+      <w:bookmarkStart w:id="29" w:name="_Toc229035143"/>
+      <w:bookmarkStart w:id="30" w:name="_Toc222817108"/>
+      <w:bookmarkStart w:id="31" w:name="_Toc239941476"/>
+      <w:bookmarkEnd w:id="28"/>
       <w:r>
         <w:rPr>
           <w:sz w:val="50"/>
@@ -8489,8 +9078,9 @@
         </w:rPr>
         <w:t>Technical solution</w:t>
       </w:r>
-      <w:bookmarkEnd w:id="22"/>
-      <w:bookmarkEnd w:id="23"/>
+      <w:bookmarkEnd w:id="29"/>
+      <w:bookmarkEnd w:id="30"/>
+      <w:bookmarkEnd w:id="31"/>
     </w:p>
     <w:p>
       <w:pPr>
@@ -8500,10 +9090,11 @@
           <w:szCs w:val="50"/>
         </w:rPr>
       </w:pPr>
-      <w:bookmarkStart w:id="24" w:name="__RefHeading___Toc1049_50594169"/>
-      <w:bookmarkStart w:id="25" w:name="_Toc229035144"/>
-      <w:bookmarkStart w:id="26" w:name="_Toc222817109"/>
-      <w:bookmarkEnd w:id="24"/>
+      <w:bookmarkStart w:id="32" w:name="__RefHeading___Toc1049_50594169"/>
+      <w:bookmarkStart w:id="33" w:name="_Toc229035144"/>
+      <w:bookmarkStart w:id="34" w:name="_Toc222817109"/>
+      <w:bookmarkStart w:id="35" w:name="_Toc239941477"/>
+      <w:bookmarkEnd w:id="32"/>
       <w:r>
         <w:rPr>
           <w:sz w:val="50"/>
@@ -8511,17 +9102,19 @@
         </w:rPr>
         <w:t>Testing</w:t>
       </w:r>
-      <w:bookmarkEnd w:id="25"/>
-      <w:bookmarkEnd w:id="26"/>
+      <w:bookmarkEnd w:id="33"/>
+      <w:bookmarkEnd w:id="34"/>
+      <w:bookmarkEnd w:id="35"/>
     </w:p>
     <w:p>
       <w:pPr>
         <w:pStyle w:val="Heading1"/>
       </w:pPr>
-      <w:bookmarkStart w:id="27" w:name="__RefHeading___Toc1051_50594169"/>
-      <w:bookmarkStart w:id="28" w:name="_Toc229035145"/>
-      <w:bookmarkStart w:id="29" w:name="_Toc222817110"/>
-      <w:bookmarkEnd w:id="27"/>
+      <w:bookmarkStart w:id="36" w:name="__RefHeading___Toc1051_50594169"/>
+      <w:bookmarkStart w:id="37" w:name="_Toc229035145"/>
+      <w:bookmarkStart w:id="38" w:name="_Toc222817110"/>
+      <w:bookmarkStart w:id="39" w:name="_Toc239941478"/>
+      <w:bookmarkEnd w:id="36"/>
       <w:r>
         <w:rPr>
           <w:sz w:val="50"/>
@@ -8529,8 +9122,9 @@
         </w:rPr>
         <w:t>Evaluation</w:t>
       </w:r>
-      <w:bookmarkEnd w:id="28"/>
-      <w:bookmarkEnd w:id="29"/>
+      <w:bookmarkEnd w:id="37"/>
+      <w:bookmarkEnd w:id="38"/>
+      <w:bookmarkEnd w:id="39"/>
     </w:p>
     <w:p/>
     <w:p/>

</xml_diff>